<commit_message>
Fix typo in external sources section of project document
</commit_message>
<xml_diff>
--- a/Web Development (WEDE5112) POE.docx
+++ b/Web Development (WEDE5112) POE.docx
@@ -3675,6 +3675,7 @@
       <w:pPr>
         <w:pStyle w:val="Heading1"/>
         <w:spacing w:before="240" w:after="120" w:line="360" w:lineRule="auto"/>
+        <w:jc w:val="both"/>
         <w:rPr>
           <w:sz w:val="24"/>
           <w:szCs w:val="24"/>
@@ -3706,6 +3707,7 @@
       <w:pPr>
         <w:pStyle w:val="Heading2"/>
         <w:spacing w:before="240" w:after="120" w:line="360" w:lineRule="auto"/>
+        <w:jc w:val="both"/>
         <w:rPr>
           <w:sz w:val="26"/>
           <w:szCs w:val="26"/>
@@ -3727,6 +3729,7 @@
     <w:p>
       <w:pPr>
         <w:spacing w:line="360" w:lineRule="auto"/>
+        <w:jc w:val="both"/>
       </w:pPr>
       <w:r>
         <w:rPr>
@@ -3750,6 +3753,7 @@
     <w:p>
       <w:pPr>
         <w:spacing w:line="360" w:lineRule="auto"/>
+        <w:jc w:val="both"/>
       </w:pPr>
       <w:r>
         <w:rPr>
@@ -3763,6 +3767,7 @@
     <w:p>
       <w:pPr>
         <w:spacing w:line="360" w:lineRule="auto"/>
+        <w:jc w:val="both"/>
       </w:pPr>
       <w:r>
         <w:rPr>
@@ -3786,6 +3791,7 @@
     <w:p>
       <w:pPr>
         <w:spacing w:line="360" w:lineRule="auto"/>
+        <w:jc w:val="both"/>
       </w:pPr>
       <w:r>
         <w:rPr>
@@ -3809,6 +3815,7 @@
     <w:p>
       <w:pPr>
         <w:spacing w:line="360" w:lineRule="auto"/>
+        <w:jc w:val="both"/>
       </w:pPr>
       <w:r>
         <w:rPr>
@@ -3833,6 +3840,7 @@
       <w:pPr>
         <w:pStyle w:val="Heading2"/>
         <w:spacing w:before="240" w:after="120" w:line="360" w:lineRule="auto"/>
+        <w:jc w:val="both"/>
         <w:rPr>
           <w:sz w:val="26"/>
           <w:szCs w:val="26"/>
@@ -3860,6 +3868,7 @@
         </w:numPr>
         <w:spacing w:after="0" w:line="360" w:lineRule="auto"/>
         <w:contextualSpacing w:val="0"/>
+        <w:jc w:val="both"/>
       </w:pPr>
       <w:r>
         <w:rPr>
@@ -3879,6 +3888,7 @@
         </w:numPr>
         <w:spacing w:after="0" w:line="360" w:lineRule="auto"/>
         <w:contextualSpacing w:val="0"/>
+        <w:jc w:val="both"/>
       </w:pPr>
       <w:r>
         <w:rPr>
@@ -3898,6 +3908,7 @@
         </w:numPr>
         <w:spacing w:after="0" w:line="360" w:lineRule="auto"/>
         <w:contextualSpacing w:val="0"/>
+        <w:jc w:val="both"/>
       </w:pPr>
       <w:r>
         <w:rPr>
@@ -3911,6 +3922,7 @@
     <w:p>
       <w:pPr>
         <w:spacing w:line="360" w:lineRule="auto"/>
+        <w:jc w:val="both"/>
       </w:pPr>
       <w:r>
         <w:rPr>
@@ -3932,6 +3944,7 @@
         </w:numPr>
         <w:spacing w:after="0" w:line="360" w:lineRule="auto"/>
         <w:contextualSpacing w:val="0"/>
+        <w:jc w:val="both"/>
       </w:pPr>
       <w:r>
         <w:rPr>
@@ -3951,6 +3964,7 @@
         </w:numPr>
         <w:spacing w:after="0" w:line="360" w:lineRule="auto"/>
         <w:contextualSpacing w:val="0"/>
+        <w:jc w:val="both"/>
       </w:pPr>
       <w:r>
         <w:rPr>
@@ -3970,6 +3984,7 @@
         </w:numPr>
         <w:spacing w:after="0" w:line="360" w:lineRule="auto"/>
         <w:contextualSpacing w:val="0"/>
+        <w:jc w:val="both"/>
       </w:pPr>
       <w:r>
         <w:rPr>
@@ -3984,6 +3999,7 @@
       <w:pPr>
         <w:pStyle w:val="Heading2"/>
         <w:spacing w:before="240" w:after="120" w:line="360" w:lineRule="auto"/>
+        <w:jc w:val="both"/>
         <w:rPr>
           <w:sz w:val="26"/>
           <w:szCs w:val="26"/>
@@ -4005,6 +4021,7 @@
     <w:p>
       <w:pPr>
         <w:spacing w:line="360" w:lineRule="auto"/>
+        <w:jc w:val="both"/>
       </w:pPr>
       <w:r>
         <w:rPr>
@@ -4037,6 +4054,7 @@
       <w:pPr>
         <w:pStyle w:val="Heading2"/>
         <w:spacing w:before="240" w:after="120" w:line="360" w:lineRule="auto"/>
+        <w:jc w:val="both"/>
         <w:rPr>
           <w:sz w:val="26"/>
           <w:szCs w:val="26"/>
@@ -4064,6 +4082,7 @@
         </w:numPr>
         <w:spacing w:after="0" w:line="360" w:lineRule="auto"/>
         <w:contextualSpacing w:val="0"/>
+        <w:jc w:val="both"/>
       </w:pPr>
       <w:r>
         <w:rPr>
@@ -4083,6 +4102,7 @@
         </w:numPr>
         <w:spacing w:after="0" w:line="360" w:lineRule="auto"/>
         <w:contextualSpacing w:val="0"/>
+        <w:jc w:val="both"/>
       </w:pPr>
       <w:r>
         <w:rPr>
@@ -4103,6 +4123,7 @@
         </w:numPr>
         <w:spacing w:after="0" w:line="360" w:lineRule="auto"/>
         <w:contextualSpacing w:val="0"/>
+        <w:jc w:val="both"/>
       </w:pPr>
       <w:r>
         <w:rPr>
@@ -4122,6 +4143,7 @@
         </w:numPr>
         <w:spacing w:after="0" w:line="360" w:lineRule="auto"/>
         <w:contextualSpacing w:val="0"/>
+        <w:jc w:val="both"/>
       </w:pPr>
       <w:r>
         <w:rPr>
@@ -4141,6 +4163,7 @@
         </w:numPr>
         <w:spacing w:after="0" w:line="360" w:lineRule="auto"/>
         <w:contextualSpacing w:val="0"/>
+        <w:jc w:val="both"/>
       </w:pPr>
       <w:r>
         <w:rPr>
@@ -4155,6 +4178,7 @@
       <w:pPr>
         <w:pStyle w:val="Heading2"/>
         <w:spacing w:before="240" w:after="120" w:line="360" w:lineRule="auto"/>
+        <w:jc w:val="both"/>
         <w:rPr>
           <w:sz w:val="26"/>
           <w:szCs w:val="26"/>
@@ -4176,6 +4200,7 @@
     <w:p>
       <w:pPr>
         <w:spacing w:line="360" w:lineRule="auto"/>
+        <w:jc w:val="both"/>
       </w:pPr>
       <w:r>
         <w:rPr>
@@ -4199,6 +4224,7 @@
     <w:p>
       <w:pPr>
         <w:spacing w:line="360" w:lineRule="auto"/>
+        <w:jc w:val="both"/>
       </w:pPr>
       <w:r>
         <w:rPr>
@@ -4222,6 +4248,7 @@
     <w:p>
       <w:pPr>
         <w:spacing w:line="360" w:lineRule="auto"/>
+        <w:jc w:val="both"/>
       </w:pPr>
       <w:r>
         <w:rPr>
@@ -4245,6 +4272,7 @@
     <w:p>
       <w:pPr>
         <w:spacing w:line="360" w:lineRule="auto"/>
+        <w:jc w:val="both"/>
       </w:pPr>
       <w:r>
         <w:rPr>
@@ -4258,6 +4286,7 @@
     <w:p>
       <w:pPr>
         <w:spacing w:line="360" w:lineRule="auto"/>
+        <w:jc w:val="both"/>
       </w:pPr>
       <w:r>
         <w:rPr>
@@ -4271,6 +4300,7 @@
     <w:p>
       <w:pPr>
         <w:spacing w:line="360" w:lineRule="auto"/>
+        <w:jc w:val="both"/>
         <w:rPr>
           <w:rFonts w:ascii="Aptos" w:eastAsia="Aptos" w:hAnsi="Aptos" w:cs="Aptos"/>
           <w:b/>
@@ -4283,6 +4313,7 @@
     <w:p>
       <w:pPr>
         <w:spacing w:line="360" w:lineRule="auto"/>
+        <w:jc w:val="both"/>
         <w:rPr>
           <w:rFonts w:ascii="Aptos" w:eastAsia="Aptos" w:hAnsi="Aptos" w:cs="Aptos"/>
           <w:b/>
@@ -4295,6 +4326,7 @@
     <w:p>
       <w:pPr>
         <w:spacing w:line="360" w:lineRule="auto"/>
+        <w:jc w:val="both"/>
         <w:rPr>
           <w:rFonts w:ascii="Aptos" w:eastAsia="Aptos" w:hAnsi="Aptos" w:cs="Aptos"/>
           <w:b/>
@@ -4307,6 +4339,7 @@
     <w:p>
       <w:pPr>
         <w:spacing w:line="360" w:lineRule="auto"/>
+        <w:jc w:val="both"/>
         <w:rPr>
           <w:rFonts w:ascii="Aptos" w:eastAsia="Aptos" w:hAnsi="Aptos" w:cs="Aptos"/>
           <w:b/>
@@ -4319,6 +4352,7 @@
     <w:p>
       <w:pPr>
         <w:spacing w:line="360" w:lineRule="auto"/>
+        <w:jc w:val="both"/>
         <w:rPr>
           <w:rFonts w:ascii="Aptos" w:eastAsia="Aptos" w:hAnsi="Aptos" w:cs="Aptos"/>
           <w:b/>
@@ -4331,6 +4365,7 @@
     <w:p>
       <w:pPr>
         <w:spacing w:line="360" w:lineRule="auto"/>
+        <w:jc w:val="both"/>
         <w:rPr>
           <w:rFonts w:ascii="Aptos" w:eastAsia="Aptos" w:hAnsi="Aptos" w:cs="Aptos"/>
           <w:b/>
@@ -4343,6 +4378,7 @@
     <w:p>
       <w:pPr>
         <w:spacing w:line="360" w:lineRule="auto"/>
+        <w:jc w:val="both"/>
         <w:rPr>
           <w:rFonts w:ascii="Aptos" w:eastAsia="Aptos" w:hAnsi="Aptos" w:cs="Aptos"/>
           <w:b/>
@@ -4355,6 +4391,7 @@
     <w:p>
       <w:pPr>
         <w:spacing w:line="360" w:lineRule="auto"/>
+        <w:jc w:val="both"/>
         <w:rPr>
           <w:rFonts w:ascii="Aptos" w:eastAsia="Aptos" w:hAnsi="Aptos" w:cs="Aptos"/>
           <w:b/>
@@ -4367,6 +4404,7 @@
     <w:p>
       <w:pPr>
         <w:spacing w:line="360" w:lineRule="auto"/>
+        <w:jc w:val="both"/>
         <w:rPr>
           <w:rFonts w:ascii="Aptos" w:eastAsia="Aptos" w:hAnsi="Aptos" w:cs="Aptos"/>
           <w:b/>
@@ -4379,6 +4417,7 @@
     <w:p>
       <w:pPr>
         <w:spacing w:line="360" w:lineRule="auto"/>
+        <w:jc w:val="both"/>
         <w:rPr>
           <w:rFonts w:ascii="Aptos" w:eastAsia="Aptos" w:hAnsi="Aptos" w:cs="Aptos"/>
           <w:b/>
@@ -4391,6 +4430,7 @@
     <w:p>
       <w:pPr>
         <w:spacing w:line="360" w:lineRule="auto"/>
+        <w:jc w:val="both"/>
         <w:rPr>
           <w:rFonts w:ascii="Aptos" w:eastAsia="Aptos" w:hAnsi="Aptos" w:cs="Aptos"/>
           <w:b/>
@@ -4403,6 +4443,7 @@
     <w:p>
       <w:pPr>
         <w:spacing w:line="360" w:lineRule="auto"/>
+        <w:jc w:val="both"/>
         <w:rPr>
           <w:rFonts w:ascii="Aptos" w:eastAsia="Aptos" w:hAnsi="Aptos" w:cs="Aptos"/>
           <w:b/>
@@ -5232,6 +5273,7 @@
       <w:pPr>
         <w:pStyle w:val="Heading2"/>
         <w:spacing w:before="240" w:after="120" w:line="360" w:lineRule="auto"/>
+        <w:jc w:val="both"/>
         <w:rPr>
           <w:rFonts w:ascii="Aptos" w:eastAsia="Aptos" w:hAnsi="Aptos" w:cs="Aptos"/>
           <w:sz w:val="24"/>
@@ -5253,6 +5295,9 @@
       <w:bookmarkEnd w:id="33"/>
     </w:p>
     <w:p>
+      <w:pPr>
+        <w:jc w:val="both"/>
+      </w:pPr>
       <w:r>
         <w:rPr>
           <w:b/>
@@ -5268,6 +5313,7 @@
       <w:pPr>
         <w:pStyle w:val="Heading2"/>
         <w:spacing w:before="240" w:after="120" w:line="360" w:lineRule="auto"/>
+        <w:jc w:val="both"/>
         <w:rPr>
           <w:sz w:val="24"/>
           <w:szCs w:val="24"/>
@@ -5295,6 +5341,7 @@
         </w:numPr>
         <w:spacing w:after="0" w:line="360" w:lineRule="auto"/>
         <w:contextualSpacing w:val="0"/>
+        <w:jc w:val="both"/>
       </w:pPr>
       <w:r>
         <w:rPr>
@@ -5314,6 +5361,7 @@
         </w:numPr>
         <w:spacing w:after="0" w:line="360" w:lineRule="auto"/>
         <w:contextualSpacing w:val="0"/>
+        <w:jc w:val="both"/>
       </w:pPr>
       <w:r>
         <w:rPr>
@@ -5333,6 +5381,7 @@
         </w:numPr>
         <w:spacing w:after="0" w:line="360" w:lineRule="auto"/>
         <w:contextualSpacing w:val="0"/>
+        <w:jc w:val="both"/>
       </w:pPr>
       <w:r>
         <w:rPr>
@@ -5352,6 +5401,7 @@
         </w:numPr>
         <w:spacing w:after="0" w:line="360" w:lineRule="auto"/>
         <w:contextualSpacing w:val="0"/>
+        <w:jc w:val="both"/>
       </w:pPr>
       <w:r>
         <w:rPr>
@@ -5366,6 +5416,7 @@
       <w:pPr>
         <w:pStyle w:val="Heading2"/>
         <w:spacing w:before="240" w:after="120" w:line="360" w:lineRule="auto"/>
+        <w:jc w:val="both"/>
         <w:rPr>
           <w:sz w:val="24"/>
           <w:szCs w:val="24"/>
@@ -5387,6 +5438,7 @@
     <w:p>
       <w:pPr>
         <w:spacing w:line="360" w:lineRule="auto"/>
+        <w:jc w:val="both"/>
       </w:pPr>
       <w:r>
         <w:rPr>
@@ -5419,6 +5471,7 @@
       <w:pPr>
         <w:pStyle w:val="Heading2"/>
         <w:spacing w:before="240" w:after="120" w:line="360" w:lineRule="auto"/>
+        <w:jc w:val="both"/>
         <w:rPr>
           <w:sz w:val="24"/>
           <w:szCs w:val="24"/>
@@ -5440,6 +5493,7 @@
     <w:p>
       <w:pPr>
         <w:spacing w:line="360" w:lineRule="auto"/>
+        <w:jc w:val="both"/>
       </w:pPr>
       <w:hyperlink r:id="rId20" w:history="1">
         <w:r>
@@ -5612,6 +5666,7 @@
     </w:p>
     <w:p>
       <w:pPr>
+        <w:jc w:val="both"/>
         <w:rPr>
           <w:rFonts w:ascii="Aptos" w:hAnsi="Aptos"/>
           <w:sz w:val="22"/>
@@ -5629,6 +5684,7 @@
     </w:p>
     <w:p>
       <w:pPr>
+        <w:jc w:val="both"/>
         <w:rPr>
           <w:rFonts w:ascii="Aptos" w:hAnsi="Aptos"/>
           <w:b/>
@@ -5654,6 +5710,7 @@
           <w:ilvl w:val="0"/>
           <w:numId w:val="5"/>
         </w:numPr>
+        <w:jc w:val="both"/>
         <w:rPr>
           <w:rFonts w:ascii="Aptos" w:hAnsi="Aptos"/>
           <w:sz w:val="22"/>
@@ -5671,6 +5728,7 @@
     </w:p>
     <w:p>
       <w:pPr>
+        <w:jc w:val="both"/>
         <w:rPr>
           <w:rFonts w:ascii="Aptos" w:hAnsi="Aptos"/>
           <w:b/>
@@ -5696,6 +5754,7 @@
           <w:ilvl w:val="0"/>
           <w:numId w:val="6"/>
         </w:numPr>
+        <w:jc w:val="both"/>
         <w:rPr>
           <w:rFonts w:ascii="Aptos" w:hAnsi="Aptos"/>
           <w:sz w:val="22"/>
@@ -5717,6 +5776,7 @@
           <w:ilvl w:val="0"/>
           <w:numId w:val="6"/>
         </w:numPr>
+        <w:jc w:val="both"/>
         <w:rPr>
           <w:rFonts w:ascii="Aptos" w:hAnsi="Aptos"/>
           <w:sz w:val="22"/>
@@ -5734,6 +5794,7 @@
     </w:p>
     <w:p>
       <w:pPr>
+        <w:jc w:val="both"/>
         <w:rPr>
           <w:rFonts w:ascii="Aptos" w:hAnsi="Aptos"/>
           <w:b/>
@@ -5759,6 +5820,7 @@
           <w:ilvl w:val="0"/>
           <w:numId w:val="7"/>
         </w:numPr>
+        <w:jc w:val="both"/>
         <w:rPr>
           <w:rFonts w:ascii="Aptos" w:hAnsi="Aptos"/>
           <w:sz w:val="22"/>
@@ -5792,6 +5854,7 @@
     </w:p>
     <w:p>
       <w:pPr>
+        <w:jc w:val="both"/>
         <w:rPr>
           <w:rFonts w:ascii="Aptos" w:hAnsi="Aptos"/>
           <w:b/>
@@ -5817,6 +5880,7 @@
           <w:ilvl w:val="0"/>
           <w:numId w:val="8"/>
         </w:numPr>
+        <w:jc w:val="both"/>
         <w:rPr>
           <w:rFonts w:ascii="Aptos" w:hAnsi="Aptos"/>
           <w:sz w:val="22"/>
@@ -5834,6 +5898,7 @@
     </w:p>
     <w:p>
       <w:pPr>
+        <w:jc w:val="both"/>
         <w:rPr>
           <w:rFonts w:ascii="Aptos" w:hAnsi="Aptos"/>
           <w:b/>
@@ -5859,6 +5924,7 @@
           <w:ilvl w:val="0"/>
           <w:numId w:val="9"/>
         </w:numPr>
+        <w:jc w:val="both"/>
         <w:rPr>
           <w:rFonts w:ascii="Aptos" w:hAnsi="Aptos"/>
           <w:sz w:val="22"/>
@@ -5880,6 +5946,7 @@
           <w:ilvl w:val="0"/>
           <w:numId w:val="9"/>
         </w:numPr>
+        <w:jc w:val="both"/>
         <w:rPr>
           <w:rFonts w:ascii="Aptos" w:hAnsi="Aptos"/>
           <w:sz w:val="22"/>
@@ -5897,6 +5964,7 @@
     </w:p>
     <w:p>
       <w:pPr>
+        <w:jc w:val="both"/>
         <w:rPr>
           <w:rFonts w:ascii="Aptos" w:hAnsi="Aptos"/>
           <w:b/>
@@ -5922,6 +5990,7 @@
           <w:ilvl w:val="0"/>
           <w:numId w:val="10"/>
         </w:numPr>
+        <w:jc w:val="both"/>
         <w:rPr>
           <w:rFonts w:ascii="Aptos" w:hAnsi="Aptos"/>
           <w:sz w:val="22"/>
@@ -5953,6 +6022,7 @@
           <w:ilvl w:val="0"/>
           <w:numId w:val="10"/>
         </w:numPr>
+        <w:jc w:val="both"/>
         <w:rPr>
           <w:rFonts w:ascii="Aptos" w:hAnsi="Aptos"/>
           <w:sz w:val="22"/>
@@ -5970,6 +6040,7 @@
     </w:p>
     <w:p>
       <w:pPr>
+        <w:jc w:val="both"/>
         <w:rPr>
           <w:rFonts w:ascii="Aptos" w:hAnsi="Aptos"/>
           <w:sz w:val="22"/>
@@ -5982,7 +6053,7 @@
           <w:sz w:val="22"/>
           <w:szCs w:val="22"/>
         </w:rPr>
-        <w:t>No external text, statistic</w:t>
+        <w:t xml:space="preserve">No external text, </w:t>
       </w:r>
       <w:r>
         <w:rPr>
@@ -5990,7 +6061,7 @@
           <w:sz w:val="22"/>
           <w:szCs w:val="22"/>
         </w:rPr>
-        <w:t xml:space="preserve"> </w:t>
+        <w:t>statistics</w:t>
       </w:r>
       <w:r>
         <w:rPr>
@@ -5998,13 +6069,18 @@
           <w:sz w:val="22"/>
           <w:szCs w:val="22"/>
         </w:rPr>
-        <w:t>s, or claims have been used anywhere in the Part 1 content beyond what is listed above. Nothing has been copied from any website, textbook, or other student's work.</w:t>
-      </w:r>
-    </w:p>
-    <w:p/>
+        <w:t>, or claims have been used anywhere in the Part 1 content beyond what is listed above. Nothing has been copied from any website, textbook, or other student's work.</w:t>
+      </w:r>
+    </w:p>
+    <w:p>
+      <w:pPr>
+        <w:jc w:val="both"/>
+      </w:pPr>
+    </w:p>
     <w:p>
       <w:pPr>
         <w:pStyle w:val="Caption"/>
+        <w:jc w:val="both"/>
         <w:rPr>
           <w:rFonts w:ascii="Aptos" w:eastAsia="Times New Roman" w:hAnsi="Aptos" w:cs="Arial"/>
           <w:b/>
@@ -6024,6 +6100,7 @@
     <w:p>
       <w:pPr>
         <w:pStyle w:val="Caption"/>
+        <w:jc w:val="both"/>
         <w:rPr>
           <w:rFonts w:ascii="Aptos" w:eastAsia="Times New Roman" w:hAnsi="Aptos" w:cs="Arial"/>
           <w:b/>
@@ -8159,6 +8236,7 @@
   <w:style w:type="character" w:default="1" w:styleId="DefaultParagraphFont">
     <w:name w:val="Default Paragraph Font"/>
     <w:uiPriority w:val="1"/>
+    <w:semiHidden/>
     <w:unhideWhenUsed/>
   </w:style>
   <w:style w:type="table" w:default="1" w:styleId="TableNormal">

</xml_diff>

<commit_message>
Update budget section with detailed cost estimates and notes for Year 1
</commit_message>
<xml_diff>
--- a/Web Development (WEDE5112) POE.docx
+++ b/Web Development (WEDE5112) POE.docx
@@ -2193,25 +2193,7 @@
           <w:sz w:val="22"/>
           <w:szCs w:val="22"/>
         </w:rPr>
-        <w:t xml:space="preserve">As a newly proposed organisation, Paw Haven has no existing website; there are no legacy strengths or weaknesses to analyse. This is treated as a greenfield build. The gap </w:t>
-      </w:r>
-      <w:proofErr w:type="gramStart"/>
-      <w:r>
-        <w:rPr>
-          <w:rFonts w:ascii="Aptos" w:eastAsia="Aptos" w:hAnsi="Aptos" w:cs="Aptos"/>
-          <w:sz w:val="22"/>
-          <w:szCs w:val="22"/>
-        </w:rPr>
-        <w:t>this fills</w:t>
-      </w:r>
-      <w:proofErr w:type="gramEnd"/>
-      <w:r>
-        <w:rPr>
-          <w:rFonts w:ascii="Aptos" w:eastAsia="Aptos" w:hAnsi="Aptos" w:cs="Aptos"/>
-          <w:sz w:val="22"/>
-          <w:szCs w:val="22"/>
-        </w:rPr>
-        <w:t xml:space="preserve"> is specific: smaller NPO shelters in the area typically rely only on a Facebook page, which cannot support a structured adoption enquiry with volunteer/sponsor options</w:t>
+        <w:t>As a newly proposed organisation, Paw Haven has no existing website; there are no legacy strengths or weaknesses to analyse. This is treated as a greenfield build. The gap this fills is specific: smaller NPO shelters in the area typically rely only on a Facebook page, which cannot support a structured adoption enquiry with volunteer/sponsor options</w:t>
       </w:r>
       <w:r>
         <w:rPr>
@@ -3506,45 +3488,613 @@
       <w:bookmarkEnd w:id="16"/>
       <w:bookmarkEnd w:id="17"/>
     </w:p>
+    <w:tbl>
+      <w:tblPr>
+        <w:tblStyle w:val="TableGrid"/>
+        <w:tblW w:w="10379" w:type="dxa"/>
+        <w:jc w:val="center"/>
+        <w:tblLayout w:type="fixed"/>
+        <w:tblLook w:val="04A0" w:firstRow="1" w:lastRow="0" w:firstColumn="1" w:lastColumn="0" w:noHBand="0" w:noVBand="1"/>
+      </w:tblPr>
+      <w:tblGrid>
+        <w:gridCol w:w="2378"/>
+        <w:gridCol w:w="1730"/>
+        <w:gridCol w:w="6271"/>
+      </w:tblGrid>
+      <w:tr>
+        <w:trPr>
+          <w:trHeight w:val="261"/>
+          <w:jc w:val="center"/>
+        </w:trPr>
+        <w:tc>
+          <w:tcPr>
+            <w:tcW w:w="2378" w:type="dxa"/>
+            <w:vAlign w:val="center"/>
+          </w:tcPr>
+          <w:p>
+            <w:pPr>
+              <w:rPr>
+                <w:sz w:val="24"/>
+                <w:szCs w:val="32"/>
+              </w:rPr>
+            </w:pPr>
+            <w:r>
+              <w:rPr>
+                <w:b/>
+                <w:sz w:val="24"/>
+                <w:szCs w:val="32"/>
+              </w:rPr>
+              <w:t>Item</w:t>
+            </w:r>
+          </w:p>
+        </w:tc>
+        <w:tc>
+          <w:tcPr>
+            <w:tcW w:w="1730" w:type="dxa"/>
+            <w:vAlign w:val="center"/>
+          </w:tcPr>
+          <w:p>
+            <w:pPr>
+              <w:rPr>
+                <w:sz w:val="24"/>
+                <w:szCs w:val="32"/>
+              </w:rPr>
+            </w:pPr>
+            <w:r>
+              <w:rPr>
+                <w:b/>
+                <w:sz w:val="24"/>
+                <w:szCs w:val="32"/>
+              </w:rPr>
+              <w:t>Cost (Year 1)</w:t>
+            </w:r>
+          </w:p>
+        </w:tc>
+        <w:tc>
+          <w:tcPr>
+            <w:tcW w:w="6271" w:type="dxa"/>
+            <w:vAlign w:val="center"/>
+          </w:tcPr>
+          <w:p>
+            <w:pPr>
+              <w:rPr>
+                <w:sz w:val="24"/>
+                <w:szCs w:val="32"/>
+              </w:rPr>
+            </w:pPr>
+            <w:r>
+              <w:rPr>
+                <w:b/>
+                <w:sz w:val="24"/>
+                <w:szCs w:val="32"/>
+              </w:rPr>
+              <w:t>Notes</w:t>
+            </w:r>
+          </w:p>
+        </w:tc>
+      </w:tr>
+      <w:tr>
+        <w:trPr>
+          <w:trHeight w:val="1397"/>
+          <w:jc w:val="center"/>
+        </w:trPr>
+        <w:tc>
+          <w:tcPr>
+            <w:tcW w:w="2378" w:type="dxa"/>
+            <w:vAlign w:val="center"/>
+          </w:tcPr>
+          <w:p>
+            <w:pPr>
+              <w:rPr>
+                <w:sz w:val="24"/>
+                <w:szCs w:val="32"/>
+              </w:rPr>
+            </w:pPr>
+            <w:r>
+              <w:rPr>
+                <w:sz w:val="24"/>
+                <w:szCs w:val="32"/>
+              </w:rPr>
+              <w:t>Development</w:t>
+            </w:r>
+          </w:p>
+        </w:tc>
+        <w:tc>
+          <w:tcPr>
+            <w:tcW w:w="1730" w:type="dxa"/>
+            <w:vAlign w:val="center"/>
+          </w:tcPr>
+          <w:p>
+            <w:pPr>
+              <w:rPr>
+                <w:sz w:val="24"/>
+                <w:szCs w:val="32"/>
+              </w:rPr>
+            </w:pPr>
+            <w:r>
+              <w:rPr>
+                <w:sz w:val="24"/>
+                <w:szCs w:val="32"/>
+              </w:rPr>
+              <w:t>R12,000</w:t>
+            </w:r>
+          </w:p>
+        </w:tc>
+        <w:tc>
+          <w:tcPr>
+            <w:tcW w:w="6271" w:type="dxa"/>
+            <w:vAlign w:val="center"/>
+          </w:tcPr>
+          <w:p>
+            <w:pPr>
+              <w:rPr>
+                <w:sz w:val="24"/>
+                <w:szCs w:val="32"/>
+              </w:rPr>
+            </w:pPr>
+            <w:r>
+              <w:rPr>
+                <w:sz w:val="24"/>
+                <w:szCs w:val="32"/>
+              </w:rPr>
+              <w:t>Built by the student as part of this module. Equivalent freelance-built 5-page site: R7,000–R25,000 in the South African market (Sharma, 2026).</w:t>
+            </w:r>
+          </w:p>
+        </w:tc>
+      </w:tr>
+      <w:tr>
+        <w:trPr>
+          <w:trHeight w:val="1119"/>
+          <w:jc w:val="center"/>
+        </w:trPr>
+        <w:tc>
+          <w:tcPr>
+            <w:tcW w:w="2378" w:type="dxa"/>
+            <w:vAlign w:val="center"/>
+          </w:tcPr>
+          <w:p>
+            <w:pPr>
+              <w:rPr>
+                <w:sz w:val="24"/>
+                <w:szCs w:val="32"/>
+              </w:rPr>
+            </w:pPr>
+            <w:r>
+              <w:rPr>
+                <w:sz w:val="24"/>
+                <w:szCs w:val="32"/>
+              </w:rPr>
+              <w:t>Domain registration</w:t>
+            </w:r>
+          </w:p>
+        </w:tc>
+        <w:tc>
+          <w:tcPr>
+            <w:tcW w:w="1730" w:type="dxa"/>
+            <w:vAlign w:val="center"/>
+          </w:tcPr>
+          <w:p>
+            <w:pPr>
+              <w:rPr>
+                <w:sz w:val="24"/>
+                <w:szCs w:val="32"/>
+              </w:rPr>
+            </w:pPr>
+            <w:r>
+              <w:rPr>
+                <w:sz w:val="24"/>
+                <w:szCs w:val="32"/>
+              </w:rPr>
+              <w:t>R105/year</w:t>
+            </w:r>
+          </w:p>
+        </w:tc>
+        <w:tc>
+          <w:tcPr>
+            <w:tcW w:w="6271" w:type="dxa"/>
+            <w:vAlign w:val="center"/>
+          </w:tcPr>
+          <w:p>
+            <w:pPr>
+              <w:rPr>
+                <w:sz w:val="24"/>
+                <w:szCs w:val="32"/>
+              </w:rPr>
+            </w:pPr>
+            <w:r>
+              <w:rPr>
+                <w:sz w:val="24"/>
+                <w:szCs w:val="32"/>
+              </w:rPr>
+              <w:t>pawhaven.co.za  real rate (</w:t>
+            </w:r>
+            <w:proofErr w:type="spellStart"/>
+            <w:r>
+              <w:rPr>
+                <w:sz w:val="24"/>
+                <w:szCs w:val="32"/>
+              </w:rPr>
+              <w:t>Xneelo</w:t>
+            </w:r>
+            <w:proofErr w:type="spellEnd"/>
+            <w:r>
+              <w:rPr>
+                <w:sz w:val="24"/>
+                <w:szCs w:val="32"/>
+              </w:rPr>
+              <w:t>, 2026).</w:t>
+            </w:r>
+          </w:p>
+        </w:tc>
+      </w:tr>
+      <w:tr>
+        <w:trPr>
+          <w:trHeight w:val="1121"/>
+          <w:jc w:val="center"/>
+        </w:trPr>
+        <w:tc>
+          <w:tcPr>
+            <w:tcW w:w="2378" w:type="dxa"/>
+            <w:vAlign w:val="center"/>
+          </w:tcPr>
+          <w:p>
+            <w:pPr>
+              <w:rPr>
+                <w:sz w:val="24"/>
+                <w:szCs w:val="32"/>
+              </w:rPr>
+            </w:pPr>
+            <w:r>
+              <w:rPr>
+                <w:sz w:val="24"/>
+                <w:szCs w:val="32"/>
+              </w:rPr>
+              <w:t>Hosting</w:t>
+            </w:r>
+          </w:p>
+        </w:tc>
+        <w:tc>
+          <w:tcPr>
+            <w:tcW w:w="1730" w:type="dxa"/>
+            <w:vAlign w:val="center"/>
+          </w:tcPr>
+          <w:p>
+            <w:pPr>
+              <w:rPr>
+                <w:sz w:val="24"/>
+                <w:szCs w:val="32"/>
+              </w:rPr>
+            </w:pPr>
+            <w:r>
+              <w:rPr>
+                <w:sz w:val="24"/>
+                <w:szCs w:val="32"/>
+              </w:rPr>
+              <w:t>R0</w:t>
+            </w:r>
+          </w:p>
+        </w:tc>
+        <w:tc>
+          <w:tcPr>
+            <w:tcW w:w="6271" w:type="dxa"/>
+            <w:vAlign w:val="center"/>
+          </w:tcPr>
+          <w:p>
+            <w:pPr>
+              <w:rPr>
+                <w:sz w:val="24"/>
+                <w:szCs w:val="32"/>
+              </w:rPr>
+            </w:pPr>
+            <w:r>
+              <w:rPr>
+                <w:sz w:val="24"/>
+                <w:szCs w:val="32"/>
+              </w:rPr>
+              <w:t xml:space="preserve">Netlify free tier </w:t>
+            </w:r>
+            <w:r>
+              <w:rPr>
+                <w:sz w:val="24"/>
+                <w:szCs w:val="32"/>
+              </w:rPr>
+              <w:t xml:space="preserve">is </w:t>
+            </w:r>
+            <w:r>
+              <w:rPr>
+                <w:sz w:val="24"/>
+                <w:szCs w:val="32"/>
+              </w:rPr>
+              <w:t>sufficient for a small static site at this scale.</w:t>
+            </w:r>
+          </w:p>
+        </w:tc>
+      </w:tr>
+      <w:tr>
+        <w:trPr>
+          <w:trHeight w:val="1075"/>
+          <w:jc w:val="center"/>
+        </w:trPr>
+        <w:tc>
+          <w:tcPr>
+            <w:tcW w:w="2378" w:type="dxa"/>
+            <w:vAlign w:val="center"/>
+          </w:tcPr>
+          <w:p>
+            <w:pPr>
+              <w:rPr>
+                <w:sz w:val="24"/>
+                <w:szCs w:val="32"/>
+              </w:rPr>
+            </w:pPr>
+            <w:r>
+              <w:rPr>
+                <w:sz w:val="24"/>
+                <w:szCs w:val="32"/>
+              </w:rPr>
+              <w:t>Maintenance</w:t>
+            </w:r>
+          </w:p>
+        </w:tc>
+        <w:tc>
+          <w:tcPr>
+            <w:tcW w:w="1730" w:type="dxa"/>
+            <w:vAlign w:val="center"/>
+          </w:tcPr>
+          <w:p>
+            <w:pPr>
+              <w:rPr>
+                <w:sz w:val="24"/>
+                <w:szCs w:val="32"/>
+              </w:rPr>
+            </w:pPr>
+            <w:r>
+              <w:rPr>
+                <w:sz w:val="24"/>
+                <w:szCs w:val="32"/>
+              </w:rPr>
+              <w:t>R6,000</w:t>
+            </w:r>
+          </w:p>
+        </w:tc>
+        <w:tc>
+          <w:tcPr>
+            <w:tcW w:w="6271" w:type="dxa"/>
+            <w:vAlign w:val="center"/>
+          </w:tcPr>
+          <w:p>
+            <w:pPr>
+              <w:rPr>
+                <w:sz w:val="24"/>
+                <w:szCs w:val="32"/>
+              </w:rPr>
+            </w:pPr>
+            <w:r>
+              <w:rPr>
+                <w:sz w:val="24"/>
+                <w:szCs w:val="32"/>
+              </w:rPr>
+              <w:t>Covers periodic content updates and basic upkeep across the year. A full agency retainer costs R2,000–R12,000/month in the South African market (Sharma, 2026); R6,000/year reflects lighter, in-house-adjacent maintenance for a simple static site.</w:t>
+            </w:r>
+          </w:p>
+        </w:tc>
+      </w:tr>
+      <w:tr>
+        <w:trPr>
+          <w:trHeight w:val="790"/>
+          <w:jc w:val="center"/>
+        </w:trPr>
+        <w:tc>
+          <w:tcPr>
+            <w:tcW w:w="2378" w:type="dxa"/>
+            <w:vAlign w:val="center"/>
+          </w:tcPr>
+          <w:p>
+            <w:pPr>
+              <w:rPr>
+                <w:sz w:val="24"/>
+                <w:szCs w:val="32"/>
+              </w:rPr>
+            </w:pPr>
+            <w:r>
+              <w:rPr>
+                <w:sz w:val="24"/>
+                <w:szCs w:val="32"/>
+              </w:rPr>
+              <w:t>Domain renewal (Year 2+)</w:t>
+            </w:r>
+          </w:p>
+        </w:tc>
+        <w:tc>
+          <w:tcPr>
+            <w:tcW w:w="1730" w:type="dxa"/>
+            <w:vAlign w:val="center"/>
+          </w:tcPr>
+          <w:p>
+            <w:pPr>
+              <w:rPr>
+                <w:sz w:val="24"/>
+                <w:szCs w:val="32"/>
+              </w:rPr>
+            </w:pPr>
+            <w:r>
+              <w:rPr>
+                <w:sz w:val="24"/>
+                <w:szCs w:val="32"/>
+              </w:rPr>
+              <w:t>R105/year</w:t>
+            </w:r>
+          </w:p>
+        </w:tc>
+        <w:tc>
+          <w:tcPr>
+            <w:tcW w:w="6271" w:type="dxa"/>
+            <w:vAlign w:val="center"/>
+          </w:tcPr>
+          <w:p>
+            <w:pPr>
+              <w:rPr>
+                <w:sz w:val="24"/>
+                <w:szCs w:val="32"/>
+              </w:rPr>
+            </w:pPr>
+            <w:r>
+              <w:rPr>
+                <w:sz w:val="24"/>
+                <w:szCs w:val="32"/>
+              </w:rPr>
+              <w:t>Ongoing cost after Year 1, same real rate.</w:t>
+            </w:r>
+          </w:p>
+        </w:tc>
+      </w:tr>
+      <w:tr>
+        <w:trPr>
+          <w:trHeight w:val="706"/>
+          <w:jc w:val="center"/>
+        </w:trPr>
+        <w:tc>
+          <w:tcPr>
+            <w:tcW w:w="2378" w:type="dxa"/>
+            <w:vAlign w:val="center"/>
+          </w:tcPr>
+          <w:p>
+            <w:pPr>
+              <w:rPr>
+                <w:sz w:val="24"/>
+                <w:szCs w:val="32"/>
+              </w:rPr>
+            </w:pPr>
+            <w:r>
+              <w:rPr>
+                <w:sz w:val="24"/>
+                <w:szCs w:val="32"/>
+              </w:rPr>
+              <w:t>Contingency</w:t>
+            </w:r>
+          </w:p>
+        </w:tc>
+        <w:tc>
+          <w:tcPr>
+            <w:tcW w:w="1730" w:type="dxa"/>
+            <w:vAlign w:val="center"/>
+          </w:tcPr>
+          <w:p>
+            <w:pPr>
+              <w:rPr>
+                <w:sz w:val="24"/>
+                <w:szCs w:val="32"/>
+              </w:rPr>
+            </w:pPr>
+            <w:r>
+              <w:rPr>
+                <w:sz w:val="24"/>
+                <w:szCs w:val="32"/>
+              </w:rPr>
+              <w:t>R50</w:t>
+            </w:r>
+          </w:p>
+        </w:tc>
+        <w:tc>
+          <w:tcPr>
+            <w:tcW w:w="6271" w:type="dxa"/>
+            <w:vAlign w:val="center"/>
+          </w:tcPr>
+          <w:p>
+            <w:pPr>
+              <w:rPr>
+                <w:sz w:val="24"/>
+                <w:szCs w:val="32"/>
+              </w:rPr>
+            </w:pPr>
+            <w:r>
+              <w:rPr>
+                <w:sz w:val="24"/>
+                <w:szCs w:val="32"/>
+              </w:rPr>
+              <w:t>Buffer for small unforeseen costs.</w:t>
+            </w:r>
+          </w:p>
+        </w:tc>
+      </w:tr>
+      <w:tr>
+        <w:trPr>
+          <w:trHeight w:val="968"/>
+          <w:jc w:val="center"/>
+        </w:trPr>
+        <w:tc>
+          <w:tcPr>
+            <w:tcW w:w="2378" w:type="dxa"/>
+            <w:vAlign w:val="center"/>
+          </w:tcPr>
+          <w:p>
+            <w:pPr>
+              <w:rPr>
+                <w:sz w:val="24"/>
+                <w:szCs w:val="32"/>
+              </w:rPr>
+            </w:pPr>
+            <w:r>
+              <w:rPr>
+                <w:b/>
+                <w:sz w:val="24"/>
+                <w:szCs w:val="32"/>
+              </w:rPr>
+              <w:t>Estimated actual cash cost (Year 1)</w:t>
+            </w:r>
+          </w:p>
+        </w:tc>
+        <w:tc>
+          <w:tcPr>
+            <w:tcW w:w="1730" w:type="dxa"/>
+            <w:vAlign w:val="center"/>
+          </w:tcPr>
+          <w:p>
+            <w:pPr>
+              <w:rPr>
+                <w:sz w:val="24"/>
+                <w:szCs w:val="32"/>
+              </w:rPr>
+            </w:pPr>
+            <w:r>
+              <w:rPr>
+                <w:b/>
+                <w:sz w:val="24"/>
+                <w:szCs w:val="32"/>
+              </w:rPr>
+              <w:t>R18,155</w:t>
+            </w:r>
+          </w:p>
+        </w:tc>
+        <w:tc>
+          <w:tcPr>
+            <w:tcW w:w="6271" w:type="dxa"/>
+            <w:vAlign w:val="center"/>
+          </w:tcPr>
+          <w:p>
+            <w:pPr>
+              <w:rPr>
+                <w:sz w:val="24"/>
+                <w:szCs w:val="32"/>
+              </w:rPr>
+            </w:pPr>
+            <w:r>
+              <w:rPr>
+                <w:b/>
+                <w:sz w:val="24"/>
+                <w:szCs w:val="32"/>
+              </w:rPr>
+              <w:t>Domain + development + maintenance + contingency; only hosting remains free-tier.</w:t>
+            </w:r>
+          </w:p>
+        </w:tc>
+      </w:tr>
+    </w:tbl>
     <w:p>
       <w:pPr>
         <w:spacing w:line="360" w:lineRule="auto"/>
         <w:jc w:val="both"/>
       </w:pPr>
-      <w:r>
-        <w:rPr>
-          <w:rFonts w:ascii="Aptos" w:eastAsia="Aptos" w:hAnsi="Aptos" w:cs="Aptos"/>
-          <w:sz w:val="22"/>
-          <w:szCs w:val="22"/>
-        </w:rPr>
-        <w:t>Based</w:t>
-      </w:r>
-      <w:r>
-        <w:rPr>
-          <w:rFonts w:ascii="Aptos" w:eastAsia="Aptos" w:hAnsi="Aptos" w:cs="Aptos"/>
-          <w:sz w:val="22"/>
-          <w:szCs w:val="22"/>
-        </w:rPr>
-        <w:t xml:space="preserve"> on real market rates. Domain registration R105/year (</w:t>
-      </w:r>
-      <w:proofErr w:type="spellStart"/>
-      <w:r>
-        <w:rPr>
-          <w:rFonts w:ascii="Aptos" w:eastAsia="Aptos" w:hAnsi="Aptos" w:cs="Aptos"/>
-          <w:sz w:val="22"/>
-          <w:szCs w:val="22"/>
-        </w:rPr>
-        <w:t>xneelo</w:t>
-      </w:r>
-      <w:proofErr w:type="spellEnd"/>
-      <w:r>
-        <w:rPr>
-          <w:rFonts w:ascii="Aptos" w:eastAsia="Aptos" w:hAnsi="Aptos" w:cs="Aptos"/>
-          <w:sz w:val="22"/>
-          <w:szCs w:val="22"/>
-        </w:rPr>
-        <w:t>, 2026). Free-tier hosting via Netlify: R0. Stock/CC imagery: R0. Estimated notional total: under R150.</w:t>
-      </w:r>
     </w:p>
     <w:p>
       <w:pPr>
@@ -3655,6 +4205,40 @@
       </w:hyperlink>
     </w:p>
     <w:p>
+      <w:r>
+        <w:t xml:space="preserve">Sharma, R. 2026. Web Development Companies Cost in South Africa (2026): Johannesburg &amp; Cape Town Pricing Guide. [Online]. Available at: </w:t>
+      </w:r>
+      <w:hyperlink r:id="rId15" w:history="1">
+        <w:r>
+          <w:rPr>
+            <w:rStyle w:val="Hyperlink"/>
+          </w:rPr>
+          <w:t>https://www.naveck.com/blog/web-development-cost-south-a</w:t>
+        </w:r>
+        <w:r>
+          <w:rPr>
+            <w:rStyle w:val="Hyperlink"/>
+          </w:rPr>
+          <w:t>f</w:t>
+        </w:r>
+        <w:r>
+          <w:rPr>
+            <w:rStyle w:val="Hyperlink"/>
+          </w:rPr>
+          <w:t>rica/</w:t>
+        </w:r>
+      </w:hyperlink>
+      <w:r>
+        <w:t xml:space="preserve"> </w:t>
+      </w:r>
+      <w:r>
+        <w:t xml:space="preserve"> [Accessed 17 September 2026.</w:t>
+      </w:r>
+      <w:r>
+        <w:t xml:space="preserve"> </w:t>
+      </w:r>
+    </w:p>
+    <w:p>
       <w:pPr>
         <w:spacing w:line="360" w:lineRule="auto"/>
         <w:jc w:val="both"/>
@@ -4029,25 +4613,7 @@
           <w:sz w:val="22"/>
           <w:szCs w:val="22"/>
         </w:rPr>
-        <w:t xml:space="preserve">Kelder &amp; Vine is proposed as a new business with no existing website; this project establishes its first web presence rather than redesigning an existing one. The gap </w:t>
-      </w:r>
-      <w:proofErr w:type="gramStart"/>
-      <w:r>
-        <w:rPr>
-          <w:rFonts w:ascii="Aptos" w:eastAsia="Aptos" w:hAnsi="Aptos" w:cs="Aptos"/>
-          <w:sz w:val="22"/>
-          <w:szCs w:val="22"/>
-        </w:rPr>
-        <w:t>this fills</w:t>
-      </w:r>
-      <w:proofErr w:type="gramEnd"/>
-      <w:r>
-        <w:rPr>
-          <w:rFonts w:ascii="Aptos" w:eastAsia="Aptos" w:hAnsi="Aptos" w:cs="Aptos"/>
-          <w:sz w:val="22"/>
-          <w:szCs w:val="22"/>
-        </w:rPr>
-        <w:t xml:space="preserve"> is specific: independent Stellenbosch wine-and-deli sellers without a site rely on passing foot traffic alone, missing tourists who plan visits online before arriving — a dedicated site captures that pre-visit search.</w:t>
+        <w:t>Kelder &amp; Vine is proposed as a new business with no existing website; this project establishes its first web presence rather than redesigning an existing one. The gap this fills is specific: independent Stellenbosch wine-and-deli sellers without a site rely on passing foot traffic alone, missing tourists who plan visits online before arriving — a dedicated site captures that pre-visit search.</w:t>
       </w:r>
     </w:p>
     <w:p>
@@ -4482,284 +5048,6 @@
             <wp:extent cx="5105400" cy="3822700"/>
             <wp:effectExtent l="0" t="0" r="0" b="6350"/>
             <wp:docPr id="76964292" name="Picture 76964292"/>
-            <wp:cNvGraphicFramePr>
-              <a:graphicFrameLocks xmlns:a="http://schemas.openxmlformats.org/drawingml/2006/main" noChangeAspect="1"/>
-            </wp:cNvGraphicFramePr>
-            <a:graphic xmlns:a="http://schemas.openxmlformats.org/drawingml/2006/main">
-              <a:graphicData uri="http://schemas.openxmlformats.org/drawingml/2006/picture">
-                <pic:pic xmlns:pic="http://schemas.openxmlformats.org/drawingml/2006/picture">
-                  <pic:nvPicPr>
-                    <pic:cNvPr id="0" name=""/>
-                    <pic:cNvPicPr>
-                      <a:picLocks noChangeAspect="1" noChangeArrowheads="1"/>
-                    </pic:cNvPicPr>
-                  </pic:nvPicPr>
-                  <pic:blipFill>
-                    <a:blip r:embed="rId15"/>
-                    <a:srcRect/>
-                    <a:stretch>
-                      <a:fillRect/>
-                    </a:stretch>
-                  </pic:blipFill>
-                  <pic:spPr bwMode="auto">
-                    <a:xfrm>
-                      <a:off x="0" y="0"/>
-                      <a:ext cx="5105400" cy="3822700"/>
-                    </a:xfrm>
-                    <a:prstGeom prst="rect">
-                      <a:avLst/>
-                    </a:prstGeom>
-                  </pic:spPr>
-                </pic:pic>
-              </a:graphicData>
-            </a:graphic>
-          </wp:inline>
-        </w:drawing>
-      </w:r>
-    </w:p>
-    <w:p>
-      <w:pPr>
-        <w:pStyle w:val="Caption"/>
-        <w:rPr>
-          <w:sz w:val="20"/>
-          <w:szCs w:val="20"/>
-        </w:rPr>
-      </w:pPr>
-      <w:r>
-        <w:rPr>
-          <w:sz w:val="20"/>
-          <w:szCs w:val="20"/>
-        </w:rPr>
-        <w:t xml:space="preserve">Figure </w:t>
-      </w:r>
-      <w:r>
-        <w:rPr>
-          <w:sz w:val="20"/>
-          <w:szCs w:val="20"/>
-        </w:rPr>
-        <w:fldChar w:fldCharType="begin"/>
-      </w:r>
-      <w:r>
-        <w:rPr>
-          <w:sz w:val="20"/>
-          <w:szCs w:val="20"/>
-        </w:rPr>
-        <w:instrText xml:space="preserve"> SEQ Figure \* ARABIC </w:instrText>
-      </w:r>
-      <w:r>
-        <w:rPr>
-          <w:sz w:val="20"/>
-          <w:szCs w:val="20"/>
-        </w:rPr>
-        <w:fldChar w:fldCharType="separate"/>
-      </w:r>
-      <w:r>
-        <w:rPr>
-          <w:noProof/>
-          <w:sz w:val="20"/>
-          <w:szCs w:val="20"/>
-        </w:rPr>
-        <w:t>6</w:t>
-      </w:r>
-      <w:r>
-        <w:rPr>
-          <w:sz w:val="20"/>
-          <w:szCs w:val="20"/>
-        </w:rPr>
-        <w:fldChar w:fldCharType="end"/>
-      </w:r>
-      <w:r>
-        <w:rPr>
-          <w:sz w:val="20"/>
-          <w:szCs w:val="20"/>
-        </w:rPr>
-        <w:t>: Home page wireframe — Kelder &amp; Vine. [Personal drawing].</w:t>
-      </w:r>
-    </w:p>
-    <w:p>
-      <w:pPr>
-        <w:spacing w:line="360" w:lineRule="auto"/>
-        <w:rPr>
-          <w:rFonts w:ascii="Aptos" w:eastAsia="Aptos" w:hAnsi="Aptos" w:cs="Aptos"/>
-          <w:b/>
-          <w:bCs/>
-          <w:sz w:val="22"/>
-          <w:szCs w:val="22"/>
-        </w:rPr>
-      </w:pPr>
-    </w:p>
-    <w:p>
-      <w:pPr>
-        <w:spacing w:line="360" w:lineRule="auto"/>
-        <w:rPr>
-          <w:rFonts w:ascii="Aptos" w:eastAsia="Aptos" w:hAnsi="Aptos" w:cs="Aptos"/>
-          <w:b/>
-          <w:bCs/>
-          <w:sz w:val="22"/>
-          <w:szCs w:val="22"/>
-        </w:rPr>
-      </w:pPr>
-    </w:p>
-    <w:p>
-      <w:pPr>
-        <w:spacing w:line="360" w:lineRule="auto"/>
-        <w:rPr>
-          <w:rFonts w:ascii="Aptos" w:eastAsia="Aptos" w:hAnsi="Aptos" w:cs="Aptos"/>
-          <w:b/>
-          <w:bCs/>
-          <w:sz w:val="22"/>
-          <w:szCs w:val="22"/>
-        </w:rPr>
-      </w:pPr>
-    </w:p>
-    <w:p>
-      <w:pPr>
-        <w:spacing w:line="360" w:lineRule="auto"/>
-        <w:rPr>
-          <w:rFonts w:ascii="Aptos" w:eastAsia="Aptos" w:hAnsi="Aptos" w:cs="Aptos"/>
-          <w:b/>
-          <w:bCs/>
-          <w:sz w:val="22"/>
-          <w:szCs w:val="22"/>
-        </w:rPr>
-      </w:pPr>
-    </w:p>
-    <w:p>
-      <w:pPr>
-        <w:spacing w:line="360" w:lineRule="auto"/>
-        <w:rPr>
-          <w:rFonts w:ascii="Aptos" w:eastAsia="Aptos" w:hAnsi="Aptos" w:cs="Aptos"/>
-          <w:b/>
-          <w:bCs/>
-          <w:sz w:val="22"/>
-          <w:szCs w:val="22"/>
-        </w:rPr>
-      </w:pPr>
-    </w:p>
-    <w:p>
-      <w:pPr>
-        <w:spacing w:line="360" w:lineRule="auto"/>
-        <w:rPr>
-          <w:rFonts w:ascii="Aptos" w:eastAsia="Aptos" w:hAnsi="Aptos" w:cs="Aptos"/>
-          <w:b/>
-          <w:bCs/>
-          <w:sz w:val="22"/>
-          <w:szCs w:val="22"/>
-        </w:rPr>
-      </w:pPr>
-    </w:p>
-    <w:p>
-      <w:pPr>
-        <w:spacing w:line="360" w:lineRule="auto"/>
-        <w:rPr>
-          <w:rFonts w:ascii="Aptos" w:eastAsia="Aptos" w:hAnsi="Aptos" w:cs="Aptos"/>
-          <w:b/>
-          <w:bCs/>
-          <w:sz w:val="22"/>
-          <w:szCs w:val="22"/>
-        </w:rPr>
-      </w:pPr>
-    </w:p>
-    <w:p>
-      <w:pPr>
-        <w:spacing w:line="360" w:lineRule="auto"/>
-        <w:rPr>
-          <w:rFonts w:ascii="Aptos" w:eastAsia="Aptos" w:hAnsi="Aptos" w:cs="Aptos"/>
-          <w:b/>
-          <w:bCs/>
-          <w:sz w:val="22"/>
-          <w:szCs w:val="22"/>
-        </w:rPr>
-      </w:pPr>
-    </w:p>
-    <w:p>
-      <w:pPr>
-        <w:spacing w:line="360" w:lineRule="auto"/>
-        <w:rPr>
-          <w:rFonts w:ascii="Aptos" w:eastAsia="Aptos" w:hAnsi="Aptos" w:cs="Aptos"/>
-          <w:b/>
-          <w:bCs/>
-          <w:sz w:val="22"/>
-          <w:szCs w:val="22"/>
-        </w:rPr>
-      </w:pPr>
-    </w:p>
-    <w:p>
-      <w:pPr>
-        <w:spacing w:line="360" w:lineRule="auto"/>
-        <w:rPr>
-          <w:rFonts w:ascii="Aptos" w:eastAsia="Aptos" w:hAnsi="Aptos" w:cs="Aptos"/>
-          <w:b/>
-          <w:bCs/>
-          <w:sz w:val="22"/>
-          <w:szCs w:val="22"/>
-        </w:rPr>
-      </w:pPr>
-    </w:p>
-    <w:p>
-      <w:pPr>
-        <w:spacing w:line="360" w:lineRule="auto"/>
-        <w:rPr>
-          <w:rFonts w:ascii="Aptos" w:eastAsia="Aptos" w:hAnsi="Aptos" w:cs="Aptos"/>
-          <w:b/>
-          <w:bCs/>
-          <w:sz w:val="22"/>
-          <w:szCs w:val="22"/>
-        </w:rPr>
-      </w:pPr>
-    </w:p>
-    <w:p>
-      <w:pPr>
-        <w:spacing w:line="360" w:lineRule="auto"/>
-        <w:rPr>
-          <w:rFonts w:ascii="Aptos" w:eastAsia="Aptos" w:hAnsi="Aptos" w:cs="Aptos"/>
-          <w:b/>
-          <w:bCs/>
-          <w:sz w:val="22"/>
-          <w:szCs w:val="22"/>
-        </w:rPr>
-      </w:pPr>
-    </w:p>
-    <w:p>
-      <w:pPr>
-        <w:spacing w:line="360" w:lineRule="auto"/>
-        <w:rPr>
-          <w:rFonts w:ascii="Aptos" w:eastAsia="Aptos" w:hAnsi="Aptos" w:cs="Aptos"/>
-          <w:b/>
-          <w:bCs/>
-          <w:sz w:val="22"/>
-          <w:szCs w:val="22"/>
-        </w:rPr>
-      </w:pPr>
-    </w:p>
-    <w:p>
-      <w:pPr>
-        <w:spacing w:line="360" w:lineRule="auto"/>
-      </w:pPr>
-      <w:r>
-        <w:rPr>
-          <w:rFonts w:ascii="Aptos" w:eastAsia="Aptos" w:hAnsi="Aptos" w:cs="Aptos"/>
-          <w:b/>
-          <w:bCs/>
-          <w:sz w:val="22"/>
-          <w:szCs w:val="22"/>
-        </w:rPr>
-        <w:t>About page</w:t>
-      </w:r>
-    </w:p>
-    <w:p>
-      <w:pPr>
-        <w:keepNext/>
-      </w:pPr>
-      <w:r>
-        <w:rPr>
-          <w:noProof/>
-        </w:rPr>
-        <w:drawing>
-          <wp:inline distT="0" distB="0" distL="0" distR="0" wp14:anchorId="47B10325" wp14:editId="61049098">
-            <wp:extent cx="5480050" cy="7727950"/>
-            <wp:effectExtent l="0" t="0" r="6350" b="6350"/>
-            <wp:docPr id="985062277" name="Picture 985062277"/>
             <wp:cNvGraphicFramePr>
               <a:graphicFrameLocks xmlns:a="http://schemas.openxmlformats.org/drawingml/2006/main" noChangeAspect="1"/>
             </wp:cNvGraphicFramePr>
@@ -4782,7 +5070,7 @@
                   <pic:spPr bwMode="auto">
                     <a:xfrm>
                       <a:off x="0" y="0"/>
-                      <a:ext cx="5480050" cy="7727950"/>
+                      <a:ext cx="5105400" cy="3822700"/>
                     </a:xfrm>
                     <a:prstGeom prst="rect">
                       <a:avLst/>
@@ -4837,7 +5125,7 @@
           <w:sz w:val="20"/>
           <w:szCs w:val="20"/>
         </w:rPr>
-        <w:t>7</w:t>
+        <w:t>6</w:t>
       </w:r>
       <w:r>
         <w:rPr>
@@ -4851,17 +5139,12 @@
           <w:sz w:val="20"/>
           <w:szCs w:val="20"/>
         </w:rPr>
-        <w:t>: About page wireframe — Kelder &amp; Vine. [Personal drawing].</w:t>
-      </w:r>
-      <w:r>
-        <w:br w:type="page"/>
+        <w:t>: Home page wireframe — Kelder &amp; Vine. [Personal drawing].</w:t>
       </w:r>
     </w:p>
     <w:p>
       <w:pPr>
         <w:spacing w:line="360" w:lineRule="auto"/>
-      </w:pPr>
-      <w:r>
         <w:rPr>
           <w:rFonts w:ascii="Aptos" w:eastAsia="Aptos" w:hAnsi="Aptos" w:cs="Aptos"/>
           <w:b/>
@@ -4869,8 +5152,165 @@
           <w:sz w:val="22"/>
           <w:szCs w:val="22"/>
         </w:rPr>
-        <w:lastRenderedPageBreak/>
-        <w:t>Products page</w:t>
+      </w:pPr>
+    </w:p>
+    <w:p>
+      <w:pPr>
+        <w:spacing w:line="360" w:lineRule="auto"/>
+        <w:rPr>
+          <w:rFonts w:ascii="Aptos" w:eastAsia="Aptos" w:hAnsi="Aptos" w:cs="Aptos"/>
+          <w:b/>
+          <w:bCs/>
+          <w:sz w:val="22"/>
+          <w:szCs w:val="22"/>
+        </w:rPr>
+      </w:pPr>
+    </w:p>
+    <w:p>
+      <w:pPr>
+        <w:spacing w:line="360" w:lineRule="auto"/>
+        <w:rPr>
+          <w:rFonts w:ascii="Aptos" w:eastAsia="Aptos" w:hAnsi="Aptos" w:cs="Aptos"/>
+          <w:b/>
+          <w:bCs/>
+          <w:sz w:val="22"/>
+          <w:szCs w:val="22"/>
+        </w:rPr>
+      </w:pPr>
+    </w:p>
+    <w:p>
+      <w:pPr>
+        <w:spacing w:line="360" w:lineRule="auto"/>
+        <w:rPr>
+          <w:rFonts w:ascii="Aptos" w:eastAsia="Aptos" w:hAnsi="Aptos" w:cs="Aptos"/>
+          <w:b/>
+          <w:bCs/>
+          <w:sz w:val="22"/>
+          <w:szCs w:val="22"/>
+        </w:rPr>
+      </w:pPr>
+    </w:p>
+    <w:p>
+      <w:pPr>
+        <w:spacing w:line="360" w:lineRule="auto"/>
+        <w:rPr>
+          <w:rFonts w:ascii="Aptos" w:eastAsia="Aptos" w:hAnsi="Aptos" w:cs="Aptos"/>
+          <w:b/>
+          <w:bCs/>
+          <w:sz w:val="22"/>
+          <w:szCs w:val="22"/>
+        </w:rPr>
+      </w:pPr>
+    </w:p>
+    <w:p>
+      <w:pPr>
+        <w:spacing w:line="360" w:lineRule="auto"/>
+        <w:rPr>
+          <w:rFonts w:ascii="Aptos" w:eastAsia="Aptos" w:hAnsi="Aptos" w:cs="Aptos"/>
+          <w:b/>
+          <w:bCs/>
+          <w:sz w:val="22"/>
+          <w:szCs w:val="22"/>
+        </w:rPr>
+      </w:pPr>
+    </w:p>
+    <w:p>
+      <w:pPr>
+        <w:spacing w:line="360" w:lineRule="auto"/>
+        <w:rPr>
+          <w:rFonts w:ascii="Aptos" w:eastAsia="Aptos" w:hAnsi="Aptos" w:cs="Aptos"/>
+          <w:b/>
+          <w:bCs/>
+          <w:sz w:val="22"/>
+          <w:szCs w:val="22"/>
+        </w:rPr>
+      </w:pPr>
+    </w:p>
+    <w:p>
+      <w:pPr>
+        <w:spacing w:line="360" w:lineRule="auto"/>
+        <w:rPr>
+          <w:rFonts w:ascii="Aptos" w:eastAsia="Aptos" w:hAnsi="Aptos" w:cs="Aptos"/>
+          <w:b/>
+          <w:bCs/>
+          <w:sz w:val="22"/>
+          <w:szCs w:val="22"/>
+        </w:rPr>
+      </w:pPr>
+    </w:p>
+    <w:p>
+      <w:pPr>
+        <w:spacing w:line="360" w:lineRule="auto"/>
+        <w:rPr>
+          <w:rFonts w:ascii="Aptos" w:eastAsia="Aptos" w:hAnsi="Aptos" w:cs="Aptos"/>
+          <w:b/>
+          <w:bCs/>
+          <w:sz w:val="22"/>
+          <w:szCs w:val="22"/>
+        </w:rPr>
+      </w:pPr>
+    </w:p>
+    <w:p>
+      <w:pPr>
+        <w:spacing w:line="360" w:lineRule="auto"/>
+        <w:rPr>
+          <w:rFonts w:ascii="Aptos" w:eastAsia="Aptos" w:hAnsi="Aptos" w:cs="Aptos"/>
+          <w:b/>
+          <w:bCs/>
+          <w:sz w:val="22"/>
+          <w:szCs w:val="22"/>
+        </w:rPr>
+      </w:pPr>
+    </w:p>
+    <w:p>
+      <w:pPr>
+        <w:spacing w:line="360" w:lineRule="auto"/>
+        <w:rPr>
+          <w:rFonts w:ascii="Aptos" w:eastAsia="Aptos" w:hAnsi="Aptos" w:cs="Aptos"/>
+          <w:b/>
+          <w:bCs/>
+          <w:sz w:val="22"/>
+          <w:szCs w:val="22"/>
+        </w:rPr>
+      </w:pPr>
+    </w:p>
+    <w:p>
+      <w:pPr>
+        <w:spacing w:line="360" w:lineRule="auto"/>
+        <w:rPr>
+          <w:rFonts w:ascii="Aptos" w:eastAsia="Aptos" w:hAnsi="Aptos" w:cs="Aptos"/>
+          <w:b/>
+          <w:bCs/>
+          <w:sz w:val="22"/>
+          <w:szCs w:val="22"/>
+        </w:rPr>
+      </w:pPr>
+    </w:p>
+    <w:p>
+      <w:pPr>
+        <w:spacing w:line="360" w:lineRule="auto"/>
+        <w:rPr>
+          <w:rFonts w:ascii="Aptos" w:eastAsia="Aptos" w:hAnsi="Aptos" w:cs="Aptos"/>
+          <w:b/>
+          <w:bCs/>
+          <w:sz w:val="22"/>
+          <w:szCs w:val="22"/>
+        </w:rPr>
+      </w:pPr>
+    </w:p>
+    <w:p>
+      <w:pPr>
+        <w:spacing w:line="360" w:lineRule="auto"/>
+      </w:pPr>
+      <w:r>
+        <w:rPr>
+          <w:rFonts w:ascii="Aptos" w:eastAsia="Aptos" w:hAnsi="Aptos" w:cs="Aptos"/>
+          <w:b/>
+          <w:bCs/>
+          <w:sz w:val="22"/>
+          <w:szCs w:val="22"/>
+        </w:rPr>
+        <w:t>About page</w:t>
       </w:r>
     </w:p>
     <w:p>
@@ -4882,10 +5322,10 @@
           <w:noProof/>
         </w:rPr>
         <w:drawing>
-          <wp:inline distT="0" distB="0" distL="0" distR="0" wp14:anchorId="560F1C77" wp14:editId="6553FFE0">
-            <wp:extent cx="5638800" cy="7607300"/>
-            <wp:effectExtent l="0" t="0" r="0" b="0"/>
-            <wp:docPr id="1298478895" name="Picture 1298478895"/>
+          <wp:inline distT="0" distB="0" distL="0" distR="0" wp14:anchorId="47B10325" wp14:editId="61049098">
+            <wp:extent cx="5480050" cy="7727950"/>
+            <wp:effectExtent l="0" t="0" r="6350" b="6350"/>
+            <wp:docPr id="985062277" name="Picture 985062277"/>
             <wp:cNvGraphicFramePr>
               <a:graphicFrameLocks xmlns:a="http://schemas.openxmlformats.org/drawingml/2006/main" noChangeAspect="1"/>
             </wp:cNvGraphicFramePr>
@@ -4908,7 +5348,7 @@
                   <pic:spPr bwMode="auto">
                     <a:xfrm>
                       <a:off x="0" y="0"/>
-                      <a:ext cx="5638800" cy="7607300"/>
+                      <a:ext cx="5480050" cy="7727950"/>
                     </a:xfrm>
                     <a:prstGeom prst="rect">
                       <a:avLst/>
@@ -4963,7 +5403,7 @@
           <w:sz w:val="20"/>
           <w:szCs w:val="20"/>
         </w:rPr>
-        <w:t>8</w:t>
+        <w:t>7</w:t>
       </w:r>
       <w:r>
         <w:rPr>
@@ -4977,24 +5417,9 @@
           <w:sz w:val="20"/>
           <w:szCs w:val="20"/>
         </w:rPr>
-        <w:t>: Products page wireframe — Kelder &amp; Vine. [Personal drawing].</w:t>
-      </w:r>
-    </w:p>
-    <w:p>
-      <w:pPr>
-        <w:rPr>
-          <w:i/>
-          <w:iCs/>
-          <w:color w:val="44546A" w:themeColor="text2"/>
-          <w:sz w:val="20"/>
-          <w:szCs w:val="20"/>
-        </w:rPr>
-      </w:pPr>
-      <w:r>
-        <w:rPr>
-          <w:sz w:val="20"/>
-          <w:szCs w:val="20"/>
-        </w:rPr>
+        <w:t>: About page wireframe — Kelder &amp; Vine. [Personal drawing].</w:t>
+      </w:r>
+      <w:r>
         <w:br w:type="page"/>
       </w:r>
     </w:p>
@@ -5011,12 +5436,11 @@
           <w:szCs w:val="22"/>
         </w:rPr>
         <w:lastRenderedPageBreak/>
-        <w:t>Enquiry page</w:t>
-      </w:r>
-    </w:p>
-    <w:p>
-      <w:pPr>
-        <w:pStyle w:val="Caption"/>
+        <w:t>Products page</w:t>
+      </w:r>
+    </w:p>
+    <w:p>
+      <w:pPr>
         <w:keepNext/>
       </w:pPr>
       <w:r>
@@ -5024,10 +5448,10 @@
           <w:noProof/>
         </w:rPr>
         <w:drawing>
-          <wp:inline distT="0" distB="0" distL="0" distR="0" wp14:anchorId="121001F5" wp14:editId="1CC252D6">
-            <wp:extent cx="5448300" cy="7423150"/>
-            <wp:effectExtent l="0" t="0" r="0" b="6350"/>
-            <wp:docPr id="1460658215" name="Picture 1460658215"/>
+          <wp:inline distT="0" distB="0" distL="0" distR="0" wp14:anchorId="560F1C77" wp14:editId="6553FFE0">
+            <wp:extent cx="5638800" cy="7607300"/>
+            <wp:effectExtent l="0" t="0" r="0" b="0"/>
+            <wp:docPr id="1298478895" name="Picture 1298478895"/>
             <wp:cNvGraphicFramePr>
               <a:graphicFrameLocks xmlns:a="http://schemas.openxmlformats.org/drawingml/2006/main" noChangeAspect="1"/>
             </wp:cNvGraphicFramePr>
@@ -5050,7 +5474,7 @@
                   <pic:spPr bwMode="auto">
                     <a:xfrm>
                       <a:off x="0" y="0"/>
-                      <a:ext cx="5448300" cy="7423150"/>
+                      <a:ext cx="5638800" cy="7607300"/>
                     </a:xfrm>
                     <a:prstGeom prst="rect">
                       <a:avLst/>
@@ -5105,7 +5529,7 @@
           <w:sz w:val="20"/>
           <w:szCs w:val="20"/>
         </w:rPr>
-        <w:t>9</w:t>
+        <w:t>8</w:t>
       </w:r>
       <w:r>
         <w:rPr>
@@ -5119,7 +5543,7 @@
           <w:sz w:val="20"/>
           <w:szCs w:val="20"/>
         </w:rPr>
-        <w:t>: Enquiry page wireframe — Kelder &amp; Vine. [Personal drawing].</w:t>
+        <w:t>: Products page wireframe — Kelder &amp; Vine. [Personal drawing].</w:t>
       </w:r>
     </w:p>
     <w:p>
@@ -5153,28 +5577,23 @@
           <w:szCs w:val="22"/>
         </w:rPr>
         <w:lastRenderedPageBreak/>
-        <w:t>Contact page</w:t>
-      </w:r>
-    </w:p>
-    <w:p>
-      <w:pPr>
+        <w:t>Enquiry page</w:t>
+      </w:r>
+    </w:p>
+    <w:p>
+      <w:pPr>
+        <w:pStyle w:val="Caption"/>
         <w:keepNext/>
-        <w:rPr>
-          <w:sz w:val="28"/>
-          <w:szCs w:val="28"/>
-        </w:rPr>
       </w:pPr>
       <w:r>
         <w:rPr>
           <w:noProof/>
-          <w:sz w:val="28"/>
-          <w:szCs w:val="28"/>
         </w:rPr>
         <w:drawing>
-          <wp:inline distT="0" distB="0" distL="0" distR="0" wp14:anchorId="2C88CDEF" wp14:editId="2462F53A">
-            <wp:extent cx="5200650" cy="8108950"/>
+          <wp:inline distT="0" distB="0" distL="0" distR="0" wp14:anchorId="121001F5" wp14:editId="1CC252D6">
+            <wp:extent cx="5448300" cy="7423150"/>
             <wp:effectExtent l="0" t="0" r="0" b="6350"/>
-            <wp:docPr id="1919793741" name="Picture 1919793741"/>
+            <wp:docPr id="1460658215" name="Picture 1460658215"/>
             <wp:cNvGraphicFramePr>
               <a:graphicFrameLocks xmlns:a="http://schemas.openxmlformats.org/drawingml/2006/main" noChangeAspect="1"/>
             </wp:cNvGraphicFramePr>
@@ -5197,6 +5616,153 @@
                   <pic:spPr bwMode="auto">
                     <a:xfrm>
                       <a:off x="0" y="0"/>
+                      <a:ext cx="5448300" cy="7423150"/>
+                    </a:xfrm>
+                    <a:prstGeom prst="rect">
+                      <a:avLst/>
+                    </a:prstGeom>
+                  </pic:spPr>
+                </pic:pic>
+              </a:graphicData>
+            </a:graphic>
+          </wp:inline>
+        </w:drawing>
+      </w:r>
+    </w:p>
+    <w:p>
+      <w:pPr>
+        <w:pStyle w:val="Caption"/>
+        <w:rPr>
+          <w:sz w:val="20"/>
+          <w:szCs w:val="20"/>
+        </w:rPr>
+      </w:pPr>
+      <w:r>
+        <w:rPr>
+          <w:sz w:val="20"/>
+          <w:szCs w:val="20"/>
+        </w:rPr>
+        <w:t xml:space="preserve">Figure </w:t>
+      </w:r>
+      <w:r>
+        <w:rPr>
+          <w:sz w:val="20"/>
+          <w:szCs w:val="20"/>
+        </w:rPr>
+        <w:fldChar w:fldCharType="begin"/>
+      </w:r>
+      <w:r>
+        <w:rPr>
+          <w:sz w:val="20"/>
+          <w:szCs w:val="20"/>
+        </w:rPr>
+        <w:instrText xml:space="preserve"> SEQ Figure \* ARABIC </w:instrText>
+      </w:r>
+      <w:r>
+        <w:rPr>
+          <w:sz w:val="20"/>
+          <w:szCs w:val="20"/>
+        </w:rPr>
+        <w:fldChar w:fldCharType="separate"/>
+      </w:r>
+      <w:r>
+        <w:rPr>
+          <w:noProof/>
+          <w:sz w:val="20"/>
+          <w:szCs w:val="20"/>
+        </w:rPr>
+        <w:t>9</w:t>
+      </w:r>
+      <w:r>
+        <w:rPr>
+          <w:sz w:val="20"/>
+          <w:szCs w:val="20"/>
+        </w:rPr>
+        <w:fldChar w:fldCharType="end"/>
+      </w:r>
+      <w:r>
+        <w:rPr>
+          <w:sz w:val="20"/>
+          <w:szCs w:val="20"/>
+        </w:rPr>
+        <w:t>: Enquiry page wireframe — Kelder &amp; Vine. [Personal drawing].</w:t>
+      </w:r>
+    </w:p>
+    <w:p>
+      <w:pPr>
+        <w:rPr>
+          <w:i/>
+          <w:iCs/>
+          <w:color w:val="44546A" w:themeColor="text2"/>
+          <w:sz w:val="20"/>
+          <w:szCs w:val="20"/>
+        </w:rPr>
+      </w:pPr>
+      <w:r>
+        <w:rPr>
+          <w:sz w:val="20"/>
+          <w:szCs w:val="20"/>
+        </w:rPr>
+        <w:br w:type="page"/>
+      </w:r>
+    </w:p>
+    <w:p>
+      <w:pPr>
+        <w:spacing w:line="360" w:lineRule="auto"/>
+      </w:pPr>
+      <w:r>
+        <w:rPr>
+          <w:rFonts w:ascii="Aptos" w:eastAsia="Aptos" w:hAnsi="Aptos" w:cs="Aptos"/>
+          <w:b/>
+          <w:bCs/>
+          <w:sz w:val="22"/>
+          <w:szCs w:val="22"/>
+        </w:rPr>
+        <w:lastRenderedPageBreak/>
+        <w:t>Contact page</w:t>
+      </w:r>
+    </w:p>
+    <w:p>
+      <w:pPr>
+        <w:keepNext/>
+        <w:rPr>
+          <w:sz w:val="28"/>
+          <w:szCs w:val="28"/>
+        </w:rPr>
+      </w:pPr>
+      <w:r>
+        <w:rPr>
+          <w:noProof/>
+          <w:sz w:val="28"/>
+          <w:szCs w:val="28"/>
+        </w:rPr>
+        <w:drawing>
+          <wp:inline distT="0" distB="0" distL="0" distR="0" wp14:anchorId="2C88CDEF" wp14:editId="2462F53A">
+            <wp:extent cx="5200650" cy="8108950"/>
+            <wp:effectExtent l="0" t="0" r="0" b="6350"/>
+            <wp:docPr id="1919793741" name="Picture 1919793741"/>
+            <wp:cNvGraphicFramePr>
+              <a:graphicFrameLocks xmlns:a="http://schemas.openxmlformats.org/drawingml/2006/main" noChangeAspect="1"/>
+            </wp:cNvGraphicFramePr>
+            <a:graphic xmlns:a="http://schemas.openxmlformats.org/drawingml/2006/main">
+              <a:graphicData uri="http://schemas.openxmlformats.org/drawingml/2006/picture">
+                <pic:pic xmlns:pic="http://schemas.openxmlformats.org/drawingml/2006/picture">
+                  <pic:nvPicPr>
+                    <pic:cNvPr id="0" name=""/>
+                    <pic:cNvPicPr>
+                      <a:picLocks noChangeAspect="1" noChangeArrowheads="1"/>
+                    </pic:cNvPicPr>
+                  </pic:nvPicPr>
+                  <pic:blipFill>
+                    <a:blip r:embed="rId20"/>
+                    <a:srcRect/>
+                    <a:stretch>
+                      <a:fillRect/>
+                    </a:stretch>
+                  </pic:blipFill>
+                  <pic:spPr bwMode="auto">
+                    <a:xfrm>
+                      <a:off x="0" y="0"/>
                       <a:ext cx="5200650" cy="8108950"/>
                     </a:xfrm>
                     <a:prstGeom prst="rect">
@@ -5418,6 +5984,7 @@
         <w:spacing w:before="240" w:after="120" w:line="360" w:lineRule="auto"/>
         <w:jc w:val="both"/>
         <w:rPr>
+          <w:rFonts w:ascii="Aptos" w:eastAsia="Aptos" w:hAnsi="Aptos" w:cs="Aptos"/>
           <w:sz w:val="24"/>
           <w:szCs w:val="24"/>
         </w:rPr>
@@ -5438,35 +6005,441 @@
     <w:p>
       <w:pPr>
         <w:spacing w:line="360" w:lineRule="auto"/>
-        <w:jc w:val="both"/>
-      </w:pPr>
-      <w:r>
-        <w:rPr>
-          <w:rFonts w:ascii="Aptos" w:eastAsia="Aptos" w:hAnsi="Aptos" w:cs="Aptos"/>
-          <w:sz w:val="22"/>
-          <w:szCs w:val="22"/>
-        </w:rPr>
-        <w:t>based on real market rates. Domain registration (keldervine.co.za): R105/year (</w:t>
-      </w:r>
-      <w:proofErr w:type="spellStart"/>
-      <w:r>
-        <w:rPr>
-          <w:rFonts w:ascii="Aptos" w:eastAsia="Aptos" w:hAnsi="Aptos" w:cs="Aptos"/>
-          <w:sz w:val="22"/>
-          <w:szCs w:val="22"/>
-        </w:rPr>
-        <w:t>xneelo</w:t>
-      </w:r>
-      <w:proofErr w:type="spellEnd"/>
-      <w:r>
-        <w:rPr>
-          <w:rFonts w:ascii="Aptos" w:eastAsia="Aptos" w:hAnsi="Aptos" w:cs="Aptos"/>
-          <w:sz w:val="22"/>
-          <w:szCs w:val="22"/>
-        </w:rPr>
-        <w:t>, 2026). Free-tier hosting: R0. CC-licensed imagery: R0. Estimated notional total: under R150.</w:t>
-      </w:r>
-    </w:p>
+      </w:pPr>
+      <w:r>
+        <w:t>A realistic first-year student budget, based on real market rates rather than rough estimates.</w:t>
+      </w:r>
+    </w:p>
+    <w:tbl>
+      <w:tblPr>
+        <w:tblW w:w="0" w:type="auto"/>
+        <w:tblLook w:val="04A0" w:firstRow="1" w:lastRow="0" w:firstColumn="1" w:lastColumn="0" w:noHBand="0" w:noVBand="1"/>
+      </w:tblPr>
+      <w:tblGrid>
+        <w:gridCol w:w="3005"/>
+        <w:gridCol w:w="3005"/>
+        <w:gridCol w:w="3006"/>
+      </w:tblGrid>
+      <w:tr>
+        <w:tc>
+          <w:tcPr>
+            <w:tcW w:w="3005" w:type="dxa"/>
+            <w:tcBorders>
+              <w:top w:val="single" w:sz="4" w:space="0" w:color="888888"/>
+              <w:left w:val="single" w:sz="4" w:space="0" w:color="888888"/>
+              <w:bottom w:val="single" w:sz="4" w:space="0" w:color="888888"/>
+              <w:right w:val="single" w:sz="4" w:space="0" w:color="888888"/>
+            </w:tcBorders>
+          </w:tcPr>
+          <w:p>
+            <w:r>
+              <w:rPr>
+                <w:b/>
+              </w:rPr>
+              <w:t>Item</w:t>
+            </w:r>
+          </w:p>
+        </w:tc>
+        <w:tc>
+          <w:tcPr>
+            <w:tcW w:w="3005" w:type="dxa"/>
+            <w:tcBorders>
+              <w:top w:val="single" w:sz="4" w:space="0" w:color="888888"/>
+              <w:left w:val="single" w:sz="4" w:space="0" w:color="888888"/>
+              <w:bottom w:val="single" w:sz="4" w:space="0" w:color="888888"/>
+              <w:right w:val="single" w:sz="4" w:space="0" w:color="888888"/>
+            </w:tcBorders>
+          </w:tcPr>
+          <w:p>
+            <w:r>
+              <w:rPr>
+                <w:b/>
+              </w:rPr>
+              <w:t>Cost (Year 1)</w:t>
+            </w:r>
+          </w:p>
+        </w:tc>
+        <w:tc>
+          <w:tcPr>
+            <w:tcW w:w="3006" w:type="dxa"/>
+            <w:tcBorders>
+              <w:top w:val="single" w:sz="4" w:space="0" w:color="888888"/>
+              <w:left w:val="single" w:sz="4" w:space="0" w:color="888888"/>
+              <w:bottom w:val="single" w:sz="4" w:space="0" w:color="888888"/>
+              <w:right w:val="single" w:sz="4" w:space="0" w:color="888888"/>
+            </w:tcBorders>
+          </w:tcPr>
+          <w:p>
+            <w:r>
+              <w:rPr>
+                <w:b/>
+              </w:rPr>
+              <w:t>Notes</w:t>
+            </w:r>
+          </w:p>
+        </w:tc>
+      </w:tr>
+      <w:tr>
+        <w:tc>
+          <w:tcPr>
+            <w:tcW w:w="3005" w:type="dxa"/>
+            <w:tcBorders>
+              <w:top w:val="single" w:sz="4" w:space="0" w:color="888888"/>
+              <w:left w:val="single" w:sz="4" w:space="0" w:color="888888"/>
+              <w:bottom w:val="single" w:sz="4" w:space="0" w:color="888888"/>
+              <w:right w:val="single" w:sz="4" w:space="0" w:color="888888"/>
+            </w:tcBorders>
+          </w:tcPr>
+          <w:p>
+            <w:r>
+              <w:t>Development</w:t>
+            </w:r>
+          </w:p>
+        </w:tc>
+        <w:tc>
+          <w:tcPr>
+            <w:tcW w:w="3005" w:type="dxa"/>
+            <w:tcBorders>
+              <w:top w:val="single" w:sz="4" w:space="0" w:color="888888"/>
+              <w:left w:val="single" w:sz="4" w:space="0" w:color="888888"/>
+              <w:bottom w:val="single" w:sz="4" w:space="0" w:color="888888"/>
+              <w:right w:val="single" w:sz="4" w:space="0" w:color="888888"/>
+            </w:tcBorders>
+          </w:tcPr>
+          <w:p>
+            <w:r>
+              <w:t>R0 (in-kind)</w:t>
+            </w:r>
+          </w:p>
+        </w:tc>
+        <w:tc>
+          <w:tcPr>
+            <w:tcW w:w="3006" w:type="dxa"/>
+            <w:tcBorders>
+              <w:top w:val="single" w:sz="4" w:space="0" w:color="888888"/>
+              <w:left w:val="single" w:sz="4" w:space="0" w:color="888888"/>
+              <w:bottom w:val="single" w:sz="4" w:space="0" w:color="888888"/>
+              <w:right w:val="single" w:sz="4" w:space="0" w:color="888888"/>
+            </w:tcBorders>
+          </w:tcPr>
+          <w:p>
+            <w:r>
+              <w:t>Built by the student as part of this module. Equivalent freelance-built 5-page site: R7,000-R25,000 in the South African market (Sharma, 2026).</w:t>
+            </w:r>
+          </w:p>
+        </w:tc>
+      </w:tr>
+      <w:tr>
+        <w:tc>
+          <w:tcPr>
+            <w:tcW w:w="3005" w:type="dxa"/>
+            <w:tcBorders>
+              <w:top w:val="single" w:sz="4" w:space="0" w:color="888888"/>
+              <w:left w:val="single" w:sz="4" w:space="0" w:color="888888"/>
+              <w:bottom w:val="single" w:sz="4" w:space="0" w:color="888888"/>
+              <w:right w:val="single" w:sz="4" w:space="0" w:color="888888"/>
+            </w:tcBorders>
+          </w:tcPr>
+          <w:p>
+            <w:r>
+              <w:t>Domain registration</w:t>
+            </w:r>
+          </w:p>
+        </w:tc>
+        <w:tc>
+          <w:tcPr>
+            <w:tcW w:w="3005" w:type="dxa"/>
+            <w:tcBorders>
+              <w:top w:val="single" w:sz="4" w:space="0" w:color="888888"/>
+              <w:left w:val="single" w:sz="4" w:space="0" w:color="888888"/>
+              <w:bottom w:val="single" w:sz="4" w:space="0" w:color="888888"/>
+              <w:right w:val="single" w:sz="4" w:space="0" w:color="888888"/>
+            </w:tcBorders>
+          </w:tcPr>
+          <w:p>
+            <w:r>
+              <w:t>R105/year</w:t>
+            </w:r>
+          </w:p>
+        </w:tc>
+        <w:tc>
+          <w:tcPr>
+            <w:tcW w:w="3006" w:type="dxa"/>
+            <w:tcBorders>
+              <w:top w:val="single" w:sz="4" w:space="0" w:color="888888"/>
+              <w:left w:val="single" w:sz="4" w:space="0" w:color="888888"/>
+              <w:bottom w:val="single" w:sz="4" w:space="0" w:color="888888"/>
+              <w:right w:val="single" w:sz="4" w:space="0" w:color="888888"/>
+            </w:tcBorders>
+          </w:tcPr>
+          <w:p>
+            <w:r>
+              <w:t>keldervine.co.za — real rate (</w:t>
+            </w:r>
+            <w:proofErr w:type="spellStart"/>
+            <w:r>
+              <w:t>xneelo</w:t>
+            </w:r>
+            <w:proofErr w:type="spellEnd"/>
+            <w:r>
+              <w:t>, 2026)</w:t>
+            </w:r>
+          </w:p>
+        </w:tc>
+      </w:tr>
+      <w:tr>
+        <w:tc>
+          <w:tcPr>
+            <w:tcW w:w="3005" w:type="dxa"/>
+            <w:tcBorders>
+              <w:top w:val="single" w:sz="4" w:space="0" w:color="888888"/>
+              <w:left w:val="single" w:sz="4" w:space="0" w:color="888888"/>
+              <w:bottom w:val="single" w:sz="4" w:space="0" w:color="888888"/>
+              <w:right w:val="single" w:sz="4" w:space="0" w:color="888888"/>
+            </w:tcBorders>
+          </w:tcPr>
+          <w:p>
+            <w:r>
+              <w:t>Hosting</w:t>
+            </w:r>
+          </w:p>
+        </w:tc>
+        <w:tc>
+          <w:tcPr>
+            <w:tcW w:w="3005" w:type="dxa"/>
+            <w:tcBorders>
+              <w:top w:val="single" w:sz="4" w:space="0" w:color="888888"/>
+              <w:left w:val="single" w:sz="4" w:space="0" w:color="888888"/>
+              <w:bottom w:val="single" w:sz="4" w:space="0" w:color="888888"/>
+              <w:right w:val="single" w:sz="4" w:space="0" w:color="888888"/>
+            </w:tcBorders>
+          </w:tcPr>
+          <w:p>
+            <w:r>
+              <w:t>R0</w:t>
+            </w:r>
+          </w:p>
+        </w:tc>
+        <w:tc>
+          <w:tcPr>
+            <w:tcW w:w="3006" w:type="dxa"/>
+            <w:tcBorders>
+              <w:top w:val="single" w:sz="4" w:space="0" w:color="888888"/>
+              <w:left w:val="single" w:sz="4" w:space="0" w:color="888888"/>
+              <w:bottom w:val="single" w:sz="4" w:space="0" w:color="888888"/>
+              <w:right w:val="single" w:sz="4" w:space="0" w:color="888888"/>
+            </w:tcBorders>
+          </w:tcPr>
+          <w:p>
+            <w:r>
+              <w:t>Netlify free tier — sufficient for a small static site at this scale</w:t>
+            </w:r>
+          </w:p>
+        </w:tc>
+      </w:tr>
+      <w:tr>
+        <w:tc>
+          <w:tcPr>
+            <w:tcW w:w="3005" w:type="dxa"/>
+            <w:tcBorders>
+              <w:top w:val="single" w:sz="4" w:space="0" w:color="888888"/>
+              <w:left w:val="single" w:sz="4" w:space="0" w:color="888888"/>
+              <w:bottom w:val="single" w:sz="4" w:space="0" w:color="888888"/>
+              <w:right w:val="single" w:sz="4" w:space="0" w:color="888888"/>
+            </w:tcBorders>
+          </w:tcPr>
+          <w:p>
+            <w:r>
+              <w:t>Maintenance</w:t>
+            </w:r>
+          </w:p>
+        </w:tc>
+        <w:tc>
+          <w:tcPr>
+            <w:tcW w:w="3005" w:type="dxa"/>
+            <w:tcBorders>
+              <w:top w:val="single" w:sz="4" w:space="0" w:color="888888"/>
+              <w:left w:val="single" w:sz="4" w:space="0" w:color="888888"/>
+              <w:bottom w:val="single" w:sz="4" w:space="0" w:color="888888"/>
+              <w:right w:val="single" w:sz="4" w:space="0" w:color="888888"/>
+            </w:tcBorders>
+          </w:tcPr>
+          <w:p>
+            <w:r>
+              <w:t>R0 (volunteer-run)</w:t>
+            </w:r>
+          </w:p>
+        </w:tc>
+        <w:tc>
+          <w:tcPr>
+            <w:tcW w:w="3006" w:type="dxa"/>
+            <w:tcBorders>
+              <w:top w:val="single" w:sz="4" w:space="0" w:color="888888"/>
+              <w:left w:val="single" w:sz="4" w:space="0" w:color="888888"/>
+              <w:bottom w:val="single" w:sz="4" w:space="0" w:color="888888"/>
+              <w:right w:val="single" w:sz="4" w:space="0" w:color="888888"/>
+            </w:tcBorders>
+          </w:tcPr>
+          <w:p>
+            <w:r>
+              <w:t>Handled in-house by shelter volunteers. An equivalent paid agency retainer costs R2,000-R12,000/month in the South African market (Sharma, 2026).</w:t>
+            </w:r>
+          </w:p>
+        </w:tc>
+      </w:tr>
+      <w:tr>
+        <w:tc>
+          <w:tcPr>
+            <w:tcW w:w="3005" w:type="dxa"/>
+            <w:tcBorders>
+              <w:top w:val="single" w:sz="4" w:space="0" w:color="888888"/>
+              <w:left w:val="single" w:sz="4" w:space="0" w:color="888888"/>
+              <w:bottom w:val="single" w:sz="4" w:space="0" w:color="888888"/>
+              <w:right w:val="single" w:sz="4" w:space="0" w:color="888888"/>
+            </w:tcBorders>
+          </w:tcPr>
+          <w:p>
+            <w:r>
+              <w:lastRenderedPageBreak/>
+              <w:t>Domain renewal (Year 2+)</w:t>
+            </w:r>
+          </w:p>
+        </w:tc>
+        <w:tc>
+          <w:tcPr>
+            <w:tcW w:w="3005" w:type="dxa"/>
+            <w:tcBorders>
+              <w:top w:val="single" w:sz="4" w:space="0" w:color="888888"/>
+              <w:left w:val="single" w:sz="4" w:space="0" w:color="888888"/>
+              <w:bottom w:val="single" w:sz="4" w:space="0" w:color="888888"/>
+              <w:right w:val="single" w:sz="4" w:space="0" w:color="888888"/>
+            </w:tcBorders>
+          </w:tcPr>
+          <w:p>
+            <w:r>
+              <w:t>R105/year</w:t>
+            </w:r>
+          </w:p>
+        </w:tc>
+        <w:tc>
+          <w:tcPr>
+            <w:tcW w:w="3006" w:type="dxa"/>
+            <w:tcBorders>
+              <w:top w:val="single" w:sz="4" w:space="0" w:color="888888"/>
+              <w:left w:val="single" w:sz="4" w:space="0" w:color="888888"/>
+              <w:bottom w:val="single" w:sz="4" w:space="0" w:color="888888"/>
+              <w:right w:val="single" w:sz="4" w:space="0" w:color="888888"/>
+            </w:tcBorders>
+          </w:tcPr>
+          <w:p>
+            <w:r>
+              <w:t>Ongoing cost after Year 1, same real rate</w:t>
+            </w:r>
+          </w:p>
+        </w:tc>
+      </w:tr>
+      <w:tr>
+        <w:tc>
+          <w:tcPr>
+            <w:tcW w:w="3005" w:type="dxa"/>
+            <w:tcBorders>
+              <w:top w:val="single" w:sz="4" w:space="0" w:color="888888"/>
+              <w:left w:val="single" w:sz="4" w:space="0" w:color="888888"/>
+              <w:bottom w:val="single" w:sz="4" w:space="0" w:color="888888"/>
+              <w:right w:val="single" w:sz="4" w:space="0" w:color="888888"/>
+            </w:tcBorders>
+          </w:tcPr>
+          <w:p>
+            <w:r>
+              <w:t>Contingency</w:t>
+            </w:r>
+          </w:p>
+        </w:tc>
+        <w:tc>
+          <w:tcPr>
+            <w:tcW w:w="3005" w:type="dxa"/>
+            <w:tcBorders>
+              <w:top w:val="single" w:sz="4" w:space="0" w:color="888888"/>
+              <w:left w:val="single" w:sz="4" w:space="0" w:color="888888"/>
+              <w:bottom w:val="single" w:sz="4" w:space="0" w:color="888888"/>
+              <w:right w:val="single" w:sz="4" w:space="0" w:color="888888"/>
+            </w:tcBorders>
+          </w:tcPr>
+          <w:p>
+            <w:r>
+              <w:t>R50</w:t>
+            </w:r>
+          </w:p>
+        </w:tc>
+        <w:tc>
+          <w:tcPr>
+            <w:tcW w:w="3006" w:type="dxa"/>
+            <w:tcBorders>
+              <w:top w:val="single" w:sz="4" w:space="0" w:color="888888"/>
+              <w:left w:val="single" w:sz="4" w:space="0" w:color="888888"/>
+              <w:bottom w:val="single" w:sz="4" w:space="0" w:color="888888"/>
+              <w:right w:val="single" w:sz="4" w:space="0" w:color="888888"/>
+            </w:tcBorders>
+          </w:tcPr>
+          <w:p>
+            <w:r>
+              <w:t>Buffer for small unforeseen costs</w:t>
+            </w:r>
+          </w:p>
+        </w:tc>
+      </w:tr>
+      <w:tr>
+        <w:tc>
+          <w:tcPr>
+            <w:tcW w:w="3005" w:type="dxa"/>
+            <w:tcBorders>
+              <w:top w:val="single" w:sz="4" w:space="0" w:color="888888"/>
+              <w:left w:val="single" w:sz="4" w:space="0" w:color="888888"/>
+              <w:bottom w:val="single" w:sz="4" w:space="0" w:color="888888"/>
+              <w:right w:val="single" w:sz="4" w:space="0" w:color="888888"/>
+            </w:tcBorders>
+          </w:tcPr>
+          <w:p>
+            <w:r>
+              <w:t>Estimated actual cash cost (Year 1)</w:t>
+            </w:r>
+          </w:p>
+        </w:tc>
+        <w:tc>
+          <w:tcPr>
+            <w:tcW w:w="3005" w:type="dxa"/>
+            <w:tcBorders>
+              <w:top w:val="single" w:sz="4" w:space="0" w:color="888888"/>
+              <w:left w:val="single" w:sz="4" w:space="0" w:color="888888"/>
+              <w:bottom w:val="single" w:sz="4" w:space="0" w:color="888888"/>
+              <w:right w:val="single" w:sz="4" w:space="0" w:color="888888"/>
+            </w:tcBorders>
+          </w:tcPr>
+          <w:p>
+            <w:r>
+              <w:t>R105-R155</w:t>
+            </w:r>
+          </w:p>
+        </w:tc>
+        <w:tc>
+          <w:tcPr>
+            <w:tcW w:w="3006" w:type="dxa"/>
+            <w:tcBorders>
+              <w:top w:val="single" w:sz="4" w:space="0" w:color="888888"/>
+              <w:left w:val="single" w:sz="4" w:space="0" w:color="888888"/>
+              <w:bottom w:val="single" w:sz="4" w:space="0" w:color="888888"/>
+              <w:right w:val="single" w:sz="4" w:space="0" w:color="888888"/>
+            </w:tcBorders>
+          </w:tcPr>
+          <w:p>
+            <w:r>
+              <w:t>Domain + contingency only — development, hosting, and maintenance are in-kind or free-tier</w:t>
+            </w:r>
+          </w:p>
+        </w:tc>
+      </w:tr>
+    </w:tbl>
+    <w:p/>
     <w:p>
       <w:pPr>
         <w:pStyle w:val="Heading2"/>
@@ -5495,7 +6468,7 @@
         <w:spacing w:line="360" w:lineRule="auto"/>
         <w:jc w:val="both"/>
       </w:pPr>
-      <w:hyperlink r:id="rId20" w:history="1">
+      <w:hyperlink r:id="rId21" w:history="1">
         <w:r>
           <w:rPr>
             <w:rStyle w:val="Hyperlink"/>
@@ -5588,7 +6561,7 @@
       <w:r>
         <w:t xml:space="preserve"> </w:t>
       </w:r>
-      <w:hyperlink r:id="rId21" w:history="1">
+      <w:hyperlink r:id="rId22" w:history="1">
         <w:r>
           <w:rPr>
             <w:rStyle w:val="Hyperlink"/>
@@ -5606,6 +6579,47 @@
           <w:szCs w:val="22"/>
         </w:rPr>
         <w:t xml:space="preserve"> </w:t>
+      </w:r>
+    </w:p>
+    <w:p>
+      <w:pPr>
+        <w:spacing w:line="360" w:lineRule="auto"/>
+        <w:jc w:val="both"/>
+        <w:rPr>
+          <w:sz w:val="20"/>
+          <w:szCs w:val="20"/>
+        </w:rPr>
+      </w:pPr>
+      <w:r>
+        <w:rPr>
+          <w:sz w:val="20"/>
+          <w:szCs w:val="20"/>
+        </w:rPr>
+        <w:t xml:space="preserve">Sharma, R. 2026. Web Development Companies Cost in South Africa (2026): Johannesburg &amp; Cape Town Pricing Guide. [Online]. Available at: </w:t>
+      </w:r>
+      <w:hyperlink r:id="rId23" w:history="1">
+        <w:r>
+          <w:rPr>
+            <w:rStyle w:val="Hyperlink"/>
+            <w:sz w:val="20"/>
+            <w:szCs w:val="20"/>
+          </w:rPr>
+          <w:t>https://www.naveck.com/blog/web-development-cost-south-africa/</w:t>
+        </w:r>
+      </w:hyperlink>
+      <w:r>
+        <w:rPr>
+          <w:sz w:val="20"/>
+          <w:szCs w:val="20"/>
+        </w:rPr>
+        <w:t xml:space="preserve"> </w:t>
+      </w:r>
+      <w:r>
+        <w:rPr>
+          <w:sz w:val="20"/>
+          <w:szCs w:val="20"/>
+        </w:rPr>
+        <w:t xml:space="preserve"> [Accessed 17 September 2026].</w:t>
       </w:r>
     </w:p>
     <w:p>
@@ -6191,7 +7205,7 @@
                     <pic:cNvPicPr/>
                   </pic:nvPicPr>
                   <pic:blipFill>
-                    <a:blip r:embed="rId22">
+                    <a:blip r:embed="rId24">
                       <a:extLst>
                         <a:ext uri="{28A0092B-C50C-407E-A947-70E740481C1C}">
                           <a14:useLocalDpi xmlns:a14="http://schemas.microsoft.com/office/drawing/2010/main" val="0"/>
@@ -6218,15 +7232,7 @@
         </w:drawing>
       </w:r>
       <w:r>
-        <w:t xml:space="preserve"> 4-page hierarchy under a Home page, matching the file structure below. All </w:t>
-      </w:r>
-      <w:proofErr w:type="gramStart"/>
-      <w:r>
-        <w:t>pages</w:t>
-      </w:r>
-      <w:proofErr w:type="gramEnd"/>
-      <w:r>
-        <w:t xml:space="preserve"> link to all other pages via a shared navigation menu.</w:t>
+        <w:t xml:space="preserve"> 4-page hierarchy under a Home page, matching the file structure below. All pages link to all other pages via a shared navigation menu.</w:t>
       </w:r>
     </w:p>
     <w:p>
@@ -6271,7 +7277,7 @@
       <w:pPr>
         <w:pStyle w:val="Header"/>
       </w:pPr>
-      <w:hyperlink r:id="rId23" w:history="1">
+      <w:hyperlink r:id="rId25" w:history="1">
         <w:r>
           <w:rPr>
             <w:rStyle w:val="Hyperlink"/>
@@ -6291,7 +7297,7 @@
       </w:pPr>
     </w:p>
     <w:sectPr>
-      <w:headerReference w:type="default" r:id="rId24"/>
+      <w:headerReference w:type="default" r:id="rId26"/>
       <w:pgSz w:w="11906" w:h="16838"/>
       <w:pgMar w:top="1440" w:right="1440" w:bottom="1440" w:left="1440" w:header="708" w:footer="708" w:gutter="0"/>
       <w:cols w:space="708"/>
@@ -7807,7 +8813,7 @@
     <w:lsdException w:name="Table Web 2" w:semiHidden="1" w:unhideWhenUsed="1"/>
     <w:lsdException w:name="Table Web 3" w:semiHidden="1" w:unhideWhenUsed="1"/>
     <w:lsdException w:name="Balloon Text" w:semiHidden="1" w:unhideWhenUsed="1"/>
-    <w:lsdException w:name="Table Grid" w:uiPriority="39"/>
+    <w:lsdException w:name="Table Grid" w:uiPriority="59"/>
     <w:lsdException w:name="Table Theme" w:semiHidden="1" w:unhideWhenUsed="1"/>
     <w:lsdException w:name="Placeholder Text" w:semiHidden="1"/>
     <w:lsdException w:name="No Spacing" w:uiPriority="1" w:qFormat="1"/>
@@ -8236,7 +9242,6 @@
   <w:style w:type="character" w:default="1" w:styleId="DefaultParagraphFont">
     <w:name w:val="Default Paragraph Font"/>
     <w:uiPriority w:val="1"/>
-    <w:semiHidden/>
     <w:unhideWhenUsed/>
   </w:style>
   <w:style w:type="table" w:default="1" w:styleId="TableNormal">
@@ -8691,6 +9696,33 @@
     <w:uiPriority w:val="99"/>
     <w:rsid w:val="00F15809"/>
   </w:style>
+  <w:style w:type="table" w:styleId="TableGrid">
+    <w:name w:val="Table Grid"/>
+    <w:basedOn w:val="TableNormal"/>
+    <w:uiPriority w:val="59"/>
+    <w:rsid w:val="0002051F"/>
+    <w:pPr>
+      <w:spacing w:after="0" w:line="240" w:lineRule="auto"/>
+    </w:pPr>
+    <w:rPr>
+      <w:rFonts w:eastAsiaTheme="minorEastAsia"/>
+      <w:kern w:val="0"/>
+      <w:sz w:val="22"/>
+      <w:szCs w:val="22"/>
+      <w:lang w:val="en-US"/>
+      <w14:ligatures w14:val="none"/>
+    </w:rPr>
+    <w:tblPr>
+      <w:tblBorders>
+        <w:top w:val="single" w:sz="4" w:space="0" w:color="auto"/>
+        <w:left w:val="single" w:sz="4" w:space="0" w:color="auto"/>
+        <w:bottom w:val="single" w:sz="4" w:space="0" w:color="auto"/>
+        <w:right w:val="single" w:sz="4" w:space="0" w:color="auto"/>
+        <w:insideH w:val="single" w:sz="4" w:space="0" w:color="auto"/>
+        <w:insideV w:val="single" w:sz="4" w:space="0" w:color="auto"/>
+      </w:tblBorders>
+    </w:tblPr>
+  </w:style>
 </w:styles>
 </file>
 

</xml_diff>

<commit_message>
Update CHANGELOG.md with fixes and enhancements; add sitemap section to documentation
</commit_message>
<xml_diff>
--- a/Web Development (WEDE5112) POE.docx
+++ b/Web Development (WEDE5112) POE.docx
@@ -2193,7 +2193,25 @@
           <w:sz w:val="22"/>
           <w:szCs w:val="22"/>
         </w:rPr>
-        <w:t>As a newly proposed organisation, Paw Haven has no existing website; there are no legacy strengths or weaknesses to analyse. This is treated as a greenfield build. The gap this fills is specific: smaller NPO shelters in the area typically rely only on a Facebook page, which cannot support a structured adoption enquiry with volunteer/sponsor options</w:t>
+        <w:t xml:space="preserve">As a newly proposed organisation, Paw Haven has no existing website; there are no legacy strengths or weaknesses to analyse. This is treated as a greenfield build. The gap </w:t>
+      </w:r>
+      <w:proofErr w:type="gramStart"/>
+      <w:r>
+        <w:rPr>
+          <w:rFonts w:ascii="Aptos" w:eastAsia="Aptos" w:hAnsi="Aptos" w:cs="Aptos"/>
+          <w:sz w:val="22"/>
+          <w:szCs w:val="22"/>
+        </w:rPr>
+        <w:t>this fills</w:t>
+      </w:r>
+      <w:proofErr w:type="gramEnd"/>
+      <w:r>
+        <w:rPr>
+          <w:rFonts w:ascii="Aptos" w:eastAsia="Aptos" w:hAnsi="Aptos" w:cs="Aptos"/>
+          <w:sz w:val="22"/>
+          <w:szCs w:val="22"/>
+        </w:rPr>
+        <w:t xml:space="preserve"> is specific: smaller NPO shelters in the area typically rely only on a Facebook page, which cannot support a structured adoption enquiry with volunteer/sponsor options</w:t>
       </w:r>
       <w:r>
         <w:rPr>
@@ -3701,12 +3719,21 @@
                 <w:szCs w:val="32"/>
               </w:rPr>
             </w:pPr>
+            <w:proofErr w:type="gramStart"/>
             <w:r>
               <w:rPr>
                 <w:sz w:val="24"/>
                 <w:szCs w:val="32"/>
               </w:rPr>
-              <w:t>pawhaven.co.za  real rate (</w:t>
+              <w:t>pawhaven.co.za  real</w:t>
+            </w:r>
+            <w:proofErr w:type="gramEnd"/>
+            <w:r>
+              <w:rPr>
+                <w:sz w:val="24"/>
+                <w:szCs w:val="32"/>
+              </w:rPr>
+              <w:t xml:space="preserve"> rate (</w:t>
             </w:r>
             <w:proofErr w:type="spellStart"/>
             <w:r>
@@ -4213,29 +4240,11 @@
           <w:rPr>
             <w:rStyle w:val="Hyperlink"/>
           </w:rPr>
-          <w:t>https://www.naveck.com/blog/web-development-cost-south-a</w:t>
-        </w:r>
-        <w:r>
-          <w:rPr>
-            <w:rStyle w:val="Hyperlink"/>
-          </w:rPr>
-          <w:t>f</w:t>
-        </w:r>
-        <w:r>
-          <w:rPr>
-            <w:rStyle w:val="Hyperlink"/>
-          </w:rPr>
-          <w:t>rica/</w:t>
+          <w:t>https://www.naveck.com/blog/web-development-cost-south-africa/</w:t>
         </w:r>
       </w:hyperlink>
       <w:r>
-        <w:t xml:space="preserve"> </w:t>
-      </w:r>
-      <w:r>
-        <w:t xml:space="preserve"> [Accessed 17 September 2026.</w:t>
-      </w:r>
-      <w:r>
-        <w:t xml:space="preserve"> </w:t>
+        <w:t xml:space="preserve">  [Accessed 17 September 2026. </w:t>
       </w:r>
     </w:p>
     <w:p>
@@ -4613,7 +4622,25 @@
           <w:sz w:val="22"/>
           <w:szCs w:val="22"/>
         </w:rPr>
-        <w:t>Kelder &amp; Vine is proposed as a new business with no existing website; this project establishes its first web presence rather than redesigning an existing one. The gap this fills is specific: independent Stellenbosch wine-and-deli sellers without a site rely on passing foot traffic alone, missing tourists who plan visits online before arriving — a dedicated site captures that pre-visit search.</w:t>
+        <w:t xml:space="preserve">Kelder &amp; Vine is proposed as a new business with no existing website; this project establishes its first web presence rather than redesigning an existing one. The gap </w:t>
+      </w:r>
+      <w:proofErr w:type="gramStart"/>
+      <w:r>
+        <w:rPr>
+          <w:rFonts w:ascii="Aptos" w:eastAsia="Aptos" w:hAnsi="Aptos" w:cs="Aptos"/>
+          <w:sz w:val="22"/>
+          <w:szCs w:val="22"/>
+        </w:rPr>
+        <w:t>this fills</w:t>
+      </w:r>
+      <w:proofErr w:type="gramEnd"/>
+      <w:r>
+        <w:rPr>
+          <w:rFonts w:ascii="Aptos" w:eastAsia="Aptos" w:hAnsi="Aptos" w:cs="Aptos"/>
+          <w:sz w:val="22"/>
+          <w:szCs w:val="22"/>
+        </w:rPr>
+        <w:t xml:space="preserve"> is specific: independent Stellenbosch wine-and-deli sellers without a site rely on passing foot traffic alone, missing tourists who plan visits online before arriving — a dedicated site captures that pre-visit search.</w:t>
       </w:r>
     </w:p>
     <w:p>
@@ -7153,6 +7180,20 @@
     <w:p>
       <w:pPr>
         <w:pStyle w:val="Heading2"/>
+      </w:pPr>
+      <w:r>
+        <w:lastRenderedPageBreak/>
+        <w:t>Website Structure and Planning: Sitemap</w:t>
+      </w:r>
+    </w:p>
+    <w:p>
+      <w:r>
+        <w:t>The sitemap below shows the website's page hierarchy for the selected organisation (Paw Haven Animal Rescue), matching the final HTML file structure.</w:t>
+      </w:r>
+    </w:p>
+    <w:p>
+      <w:pPr>
+        <w:pStyle w:val="Heading2"/>
         <w:rPr>
           <w:rFonts w:ascii="Aptos" w:eastAsia="Times New Roman" w:hAnsi="Aptos"/>
           <w:i/>
@@ -7163,19 +7204,6 @@
           <w:lang w:eastAsia="en-ZA"/>
         </w:rPr>
       </w:pPr>
-      <w:bookmarkStart w:id="41" w:name="_Toc237788193"/>
-      <w:r>
-        <w:rPr>
-          <w:rFonts w:ascii="Aptos" w:eastAsia="Times New Roman" w:hAnsi="Aptos"/>
-          <w:sz w:val="24"/>
-          <w:szCs w:val="24"/>
-          <w:bdr w:val="none" w:sz="0" w:space="0" w:color="auto" w:frame="1"/>
-          <w:lang w:eastAsia="en-ZA"/>
-        </w:rPr>
-        <w:lastRenderedPageBreak/>
-        <w:t>Sitemap:</w:t>
-      </w:r>
-      <w:bookmarkEnd w:id="41"/>
     </w:p>
     <w:p>
       <w:pPr>
@@ -7232,7 +7260,15 @@
         </w:drawing>
       </w:r>
       <w:r>
-        <w:t xml:space="preserve"> 4-page hierarchy under a Home page, matching the file structure below. All pages link to all other pages via a shared navigation menu.</w:t>
+        <w:t xml:space="preserve"> 4-page hierarchy under a Home page, matching the file structure below. All </w:t>
+      </w:r>
+      <w:proofErr w:type="gramStart"/>
+      <w:r>
+        <w:t>pages</w:t>
+      </w:r>
+      <w:proofErr w:type="gramEnd"/>
+      <w:r>
+        <w:t xml:space="preserve"> link to all other pages via a shared navigation menu.</w:t>
       </w:r>
     </w:p>
     <w:p>
@@ -7254,7 +7290,7 @@
           <w:szCs w:val="24"/>
         </w:rPr>
       </w:pPr>
-      <w:bookmarkStart w:id="42" w:name="_Toc237788194"/>
+      <w:bookmarkStart w:id="41" w:name="_Toc237788194"/>
       <w:r>
         <w:rPr>
           <w:rFonts w:ascii="Aptos" w:hAnsi="Aptos"/>
@@ -7263,7 +7299,7 @@
         </w:rPr>
         <w:t>GIT HUB LINK</w:t>
       </w:r>
-      <w:bookmarkEnd w:id="42"/>
+      <w:bookmarkEnd w:id="41"/>
       <w:r>
         <w:rPr>
           <w:rFonts w:ascii="Aptos" w:hAnsi="Aptos"/>
@@ -9242,6 +9278,7 @@
   <w:style w:type="character" w:default="1" w:styleId="DefaultParagraphFont">
     <w:name w:val="Default Paragraph Font"/>
     <w:uiPriority w:val="1"/>
+    <w:semiHidden/>
     <w:unhideWhenUsed/>
   </w:style>
   <w:style w:type="table" w:default="1" w:styleId="TableNormal">

</xml_diff>

<commit_message>
Update cost estimates and maintenance details in project documentation
</commit_message>
<xml_diff>
--- a/Web Development (WEDE5112) POE.docx
+++ b/Web Development (WEDE5112) POE.docx
@@ -6043,14 +6043,14 @@
         <w:tblLook w:val="04A0" w:firstRow="1" w:lastRow="0" w:firstColumn="1" w:lastColumn="0" w:noHBand="0" w:noVBand="1"/>
       </w:tblPr>
       <w:tblGrid>
-        <w:gridCol w:w="3005"/>
-        <w:gridCol w:w="3005"/>
-        <w:gridCol w:w="3006"/>
+        <w:gridCol w:w="2880"/>
+        <w:gridCol w:w="2880"/>
+        <w:gridCol w:w="2880"/>
       </w:tblGrid>
       <w:tr>
         <w:tc>
           <w:tcPr>
-            <w:tcW w:w="3005" w:type="dxa"/>
+            <w:tcW w:w="2880" w:type="dxa"/>
             <w:tcBorders>
               <w:top w:val="single" w:sz="4" w:space="0" w:color="888888"/>
               <w:left w:val="single" w:sz="4" w:space="0" w:color="888888"/>
@@ -6069,7 +6069,7 @@
         </w:tc>
         <w:tc>
           <w:tcPr>
-            <w:tcW w:w="3005" w:type="dxa"/>
+            <w:tcW w:w="2880" w:type="dxa"/>
             <w:tcBorders>
               <w:top w:val="single" w:sz="4" w:space="0" w:color="888888"/>
               <w:left w:val="single" w:sz="4" w:space="0" w:color="888888"/>
@@ -6088,7 +6088,7 @@
         </w:tc>
         <w:tc>
           <w:tcPr>
-            <w:tcW w:w="3006" w:type="dxa"/>
+            <w:tcW w:w="2880" w:type="dxa"/>
             <w:tcBorders>
               <w:top w:val="single" w:sz="4" w:space="0" w:color="888888"/>
               <w:left w:val="single" w:sz="4" w:space="0" w:color="888888"/>
@@ -6107,9 +6107,12 @@
         </w:tc>
       </w:tr>
       <w:tr>
+        <w:trPr>
+          <w:trHeight w:val="1776"/>
+        </w:trPr>
         <w:tc>
           <w:tcPr>
-            <w:tcW w:w="3005" w:type="dxa"/>
+            <w:tcW w:w="2880" w:type="dxa"/>
             <w:tcBorders>
               <w:top w:val="single" w:sz="4" w:space="0" w:color="888888"/>
               <w:left w:val="single" w:sz="4" w:space="0" w:color="888888"/>
@@ -6125,7 +6128,7 @@
         </w:tc>
         <w:tc>
           <w:tcPr>
-            <w:tcW w:w="3005" w:type="dxa"/>
+            <w:tcW w:w="2880" w:type="dxa"/>
             <w:tcBorders>
               <w:top w:val="single" w:sz="4" w:space="0" w:color="888888"/>
               <w:left w:val="single" w:sz="4" w:space="0" w:color="888888"/>
@@ -6135,13 +6138,13 @@
           </w:tcPr>
           <w:p>
             <w:r>
-              <w:t>R0 (in-kind)</w:t>
+              <w:t>R12,000</w:t>
             </w:r>
           </w:p>
         </w:tc>
         <w:tc>
           <w:tcPr>
-            <w:tcW w:w="3006" w:type="dxa"/>
+            <w:tcW w:w="2880" w:type="dxa"/>
             <w:tcBorders>
               <w:top w:val="single" w:sz="4" w:space="0" w:color="888888"/>
               <w:left w:val="single" w:sz="4" w:space="0" w:color="888888"/>
@@ -6159,7 +6162,7 @@
       <w:tr>
         <w:tc>
           <w:tcPr>
-            <w:tcW w:w="3005" w:type="dxa"/>
+            <w:tcW w:w="2880" w:type="dxa"/>
             <w:tcBorders>
               <w:top w:val="single" w:sz="4" w:space="0" w:color="888888"/>
               <w:left w:val="single" w:sz="4" w:space="0" w:color="888888"/>
@@ -6175,7 +6178,7 @@
         </w:tc>
         <w:tc>
           <w:tcPr>
-            <w:tcW w:w="3005" w:type="dxa"/>
+            <w:tcW w:w="2880" w:type="dxa"/>
             <w:tcBorders>
               <w:top w:val="single" w:sz="4" w:space="0" w:color="888888"/>
               <w:left w:val="single" w:sz="4" w:space="0" w:color="888888"/>
@@ -6191,7 +6194,7 @@
         </w:tc>
         <w:tc>
           <w:tcPr>
-            <w:tcW w:w="3006" w:type="dxa"/>
+            <w:tcW w:w="2880" w:type="dxa"/>
             <w:tcBorders>
               <w:top w:val="single" w:sz="4" w:space="0" w:color="888888"/>
               <w:left w:val="single" w:sz="4" w:space="0" w:color="888888"/>
@@ -6205,7 +6208,7 @@
             </w:r>
             <w:proofErr w:type="spellStart"/>
             <w:r>
-              <w:t>xneelo</w:t>
+              <w:t>Xneelo</w:t>
             </w:r>
             <w:proofErr w:type="spellEnd"/>
             <w:r>
@@ -6217,7 +6220,7 @@
       <w:tr>
         <w:tc>
           <w:tcPr>
-            <w:tcW w:w="3005" w:type="dxa"/>
+            <w:tcW w:w="2880" w:type="dxa"/>
             <w:tcBorders>
               <w:top w:val="single" w:sz="4" w:space="0" w:color="888888"/>
               <w:left w:val="single" w:sz="4" w:space="0" w:color="888888"/>
@@ -6233,7 +6236,7 @@
         </w:tc>
         <w:tc>
           <w:tcPr>
-            <w:tcW w:w="3005" w:type="dxa"/>
+            <w:tcW w:w="2880" w:type="dxa"/>
             <w:tcBorders>
               <w:top w:val="single" w:sz="4" w:space="0" w:color="888888"/>
               <w:left w:val="single" w:sz="4" w:space="0" w:color="888888"/>
@@ -6249,7 +6252,7 @@
         </w:tc>
         <w:tc>
           <w:tcPr>
-            <w:tcW w:w="3006" w:type="dxa"/>
+            <w:tcW w:w="2880" w:type="dxa"/>
             <w:tcBorders>
               <w:top w:val="single" w:sz="4" w:space="0" w:color="888888"/>
               <w:left w:val="single" w:sz="4" w:space="0" w:color="888888"/>
@@ -6267,7 +6270,7 @@
       <w:tr>
         <w:tc>
           <w:tcPr>
-            <w:tcW w:w="3005" w:type="dxa"/>
+            <w:tcW w:w="2880" w:type="dxa"/>
             <w:tcBorders>
               <w:top w:val="single" w:sz="4" w:space="0" w:color="888888"/>
               <w:left w:val="single" w:sz="4" w:space="0" w:color="888888"/>
@@ -6283,7 +6286,7 @@
         </w:tc>
         <w:tc>
           <w:tcPr>
-            <w:tcW w:w="3005" w:type="dxa"/>
+            <w:tcW w:w="2880" w:type="dxa"/>
             <w:tcBorders>
               <w:top w:val="single" w:sz="4" w:space="0" w:color="888888"/>
               <w:left w:val="single" w:sz="4" w:space="0" w:color="888888"/>
@@ -6293,13 +6296,13 @@
           </w:tcPr>
           <w:p>
             <w:r>
-              <w:t>R0 (volunteer-run)</w:t>
+              <w:t>R6,000</w:t>
             </w:r>
           </w:p>
         </w:tc>
         <w:tc>
           <w:tcPr>
-            <w:tcW w:w="3006" w:type="dxa"/>
+            <w:tcW w:w="2880" w:type="dxa"/>
             <w:tcBorders>
               <w:top w:val="single" w:sz="4" w:space="0" w:color="888888"/>
               <w:left w:val="single" w:sz="4" w:space="0" w:color="888888"/>
@@ -6309,7 +6312,11 @@
           </w:tcPr>
           <w:p>
             <w:r>
-              <w:t>Handled in-house by shelter volunteers. An equivalent paid agency retainer costs R2,000-R12,000/month in the South African market (Sharma, 2026).</w:t>
+              <w:t xml:space="preserve">Covers periodic content updates and basic upkeep across the year. A full agency retainer costs R2,000-R12,000/month in the South African market (Sharma, 2026); </w:t>
+            </w:r>
+            <w:r>
+              <w:lastRenderedPageBreak/>
+              <w:t>R6,000/year reflects lighter, in-house-adjacent maintenance for a simple static site.</w:t>
             </w:r>
           </w:p>
         </w:tc>
@@ -6317,7 +6324,7 @@
       <w:tr>
         <w:tc>
           <w:tcPr>
-            <w:tcW w:w="3005" w:type="dxa"/>
+            <w:tcW w:w="2880" w:type="dxa"/>
             <w:tcBorders>
               <w:top w:val="single" w:sz="4" w:space="0" w:color="888888"/>
               <w:left w:val="single" w:sz="4" w:space="0" w:color="888888"/>
@@ -6334,7 +6341,7 @@
         </w:tc>
         <w:tc>
           <w:tcPr>
-            <w:tcW w:w="3005" w:type="dxa"/>
+            <w:tcW w:w="2880" w:type="dxa"/>
             <w:tcBorders>
               <w:top w:val="single" w:sz="4" w:space="0" w:color="888888"/>
               <w:left w:val="single" w:sz="4" w:space="0" w:color="888888"/>
@@ -6350,7 +6357,7 @@
         </w:tc>
         <w:tc>
           <w:tcPr>
-            <w:tcW w:w="3006" w:type="dxa"/>
+            <w:tcW w:w="2880" w:type="dxa"/>
             <w:tcBorders>
               <w:top w:val="single" w:sz="4" w:space="0" w:color="888888"/>
               <w:left w:val="single" w:sz="4" w:space="0" w:color="888888"/>
@@ -6368,7 +6375,7 @@
       <w:tr>
         <w:tc>
           <w:tcPr>
-            <w:tcW w:w="3005" w:type="dxa"/>
+            <w:tcW w:w="2880" w:type="dxa"/>
             <w:tcBorders>
               <w:top w:val="single" w:sz="4" w:space="0" w:color="888888"/>
               <w:left w:val="single" w:sz="4" w:space="0" w:color="888888"/>
@@ -6384,7 +6391,7 @@
         </w:tc>
         <w:tc>
           <w:tcPr>
-            <w:tcW w:w="3005" w:type="dxa"/>
+            <w:tcW w:w="2880" w:type="dxa"/>
             <w:tcBorders>
               <w:top w:val="single" w:sz="4" w:space="0" w:color="888888"/>
               <w:left w:val="single" w:sz="4" w:space="0" w:color="888888"/>
@@ -6400,7 +6407,7 @@
         </w:tc>
         <w:tc>
           <w:tcPr>
-            <w:tcW w:w="3006" w:type="dxa"/>
+            <w:tcW w:w="2880" w:type="dxa"/>
             <w:tcBorders>
               <w:top w:val="single" w:sz="4" w:space="0" w:color="888888"/>
               <w:left w:val="single" w:sz="4" w:space="0" w:color="888888"/>
@@ -6418,7 +6425,7 @@
       <w:tr>
         <w:tc>
           <w:tcPr>
-            <w:tcW w:w="3005" w:type="dxa"/>
+            <w:tcW w:w="2880" w:type="dxa"/>
             <w:tcBorders>
               <w:top w:val="single" w:sz="4" w:space="0" w:color="888888"/>
               <w:left w:val="single" w:sz="4" w:space="0" w:color="888888"/>
@@ -6434,7 +6441,7 @@
         </w:tc>
         <w:tc>
           <w:tcPr>
-            <w:tcW w:w="3005" w:type="dxa"/>
+            <w:tcW w:w="2880" w:type="dxa"/>
             <w:tcBorders>
               <w:top w:val="single" w:sz="4" w:space="0" w:color="888888"/>
               <w:left w:val="single" w:sz="4" w:space="0" w:color="888888"/>
@@ -6444,13 +6451,13 @@
           </w:tcPr>
           <w:p>
             <w:r>
-              <w:t>R105-R155</w:t>
+              <w:t>R18,155</w:t>
             </w:r>
           </w:p>
         </w:tc>
         <w:tc>
           <w:tcPr>
-            <w:tcW w:w="3006" w:type="dxa"/>
+            <w:tcW w:w="2880" w:type="dxa"/>
             <w:tcBorders>
               <w:top w:val="single" w:sz="4" w:space="0" w:color="888888"/>
               <w:left w:val="single" w:sz="4" w:space="0" w:color="888888"/>
@@ -6460,7 +6467,7 @@
           </w:tcPr>
           <w:p>
             <w:r>
-              <w:t>Domain + contingency only — development, hosting, and maintenance are in-kind or free-tier</w:t>
+              <w:t>Domain + development + maintenance + contingency; only hosting remains free-tier</w:t>
             </w:r>
           </w:p>
         </w:tc>

</xml_diff>